<commit_message>
Partly added 1.5 part
</commit_message>
<xml_diff>
--- a/Docs/Основное/РПЗ Диплом ШаруновРД.docx
+++ b/Docs/Основное/РПЗ Диплом ШаруновРД.docx
@@ -1621,7 +1621,7 @@
         <w:t xml:space="preserve">Внесение доработок и усовершенствование </w:t>
       </w:r>
       <w:r>
-        <w:t>на основе результатов тестирования.</w:t>
+        <w:t>на основе результатов тестирования</w:t>
       </w:r>
       <w:r>
         <w:t xml:space="preserve"> </w:t>
@@ -1642,8 +1642,1080 @@
         <w:t>Подготовка проектной документации, включая техническое задание, руководство пользователя и пояснительную записку.</w:t>
       </w:r>
     </w:p>
+    <w:p>
+      <w:pPr>
+        <w:pStyle w:val="a3"/>
+      </w:pPr>
+      <w:r>
+        <w:t>Обоснование выбора инструментов и платформы разработки</w:t>
+      </w:r>
+    </w:p>
+    <w:p>
+      <w:pPr>
+        <w:pStyle w:val="ab"/>
+      </w:pPr>
+      <w:r>
+        <w:t>Для разработки сервиса организации праздничных списков желаемого с модулем интеллектуальной генерации идей необходимы современные и эффективные инструменты и платформа. В этом разделе будут представлены основные причины выбора технологий для реализации системы, обеспечивающей не только базовый функционал управления списками, но и сложные алгоритмы рекомендательной обработки данных.</w:t>
+      </w:r>
+    </w:p>
+    <w:p>
+      <w:pPr>
+        <w:pStyle w:val="ab"/>
+        <w:spacing w:before="240"/>
+      </w:pPr>
+      <w:r>
+        <w:t>1. Архитектура системы</w:t>
+      </w:r>
+    </w:p>
+    <w:p>
+      <w:pPr>
+        <w:pStyle w:val="ab"/>
+      </w:pPr>
+      <w:r>
+        <w:lastRenderedPageBreak/>
+        <w:t xml:space="preserve">При выборе инструментов и платформы разработки необходимо составить общую архитектурную схему системы. На основе описания предметной области и требований к интеллектуальным функциям (генерация идей, персонализированный подбор), можно выделить </w:t>
+      </w:r>
+      <w:r>
+        <w:t>3</w:t>
+      </w:r>
+      <w:r>
+        <w:t xml:space="preserve"> главных элемента системы: </w:t>
+      </w:r>
+      <w:r>
+        <w:t>интернет-приложение</w:t>
+      </w:r>
+      <w:r>
+        <w:t>, модуль интеллектуальной обработки и база данных (рис. X).</w:t>
+      </w:r>
+    </w:p>
+    <w:p>
+      <w:pPr>
+        <w:pStyle w:val="ab"/>
+        <w:spacing w:before="240"/>
+      </w:pPr>
+      <w:r>
+        <w:t>2. Архитектура интернет-приложения</w:t>
+      </w:r>
+    </w:p>
+    <w:p>
+      <w:pPr>
+        <w:pStyle w:val="ab"/>
+      </w:pPr>
+      <w:r>
+        <w:t>Интернет-приложение является основным элементом системы, отвечающим за реализацию функционала организации праздничных списков желаемого и взаимодействие с пользователем. В его задачи входит управление списками подарков, реализация механизмов бронирования и организация совместного участия в покупке подарка. Важной особенностью является интеграция с внешними платформами: авторизация и получение базовых данных профиля</w:t>
+      </w:r>
+      <w:r>
+        <w:t xml:space="preserve"> </w:t>
+      </w:r>
+      <w:r>
+        <w:t xml:space="preserve">осуществляются через инструменты социальной сети или мессенджера, в который встроен сервис. Внутренняя настройка аккаунта ограничивается пользовательскими предпочтениями для работы алгоритмов рекомендаций и настройками приватности. Функция разделения стоимости подарка реализована в упрощенном виде: система фиксирует намерение пользователей объединить средства и отображает эту информацию </w:t>
+      </w:r>
+      <w:r>
+        <w:t>другим участникам мероприятия</w:t>
+      </w:r>
+      <w:r>
+        <w:t>, однако финансовые транзакции и договоренности происходят вне приложения</w:t>
+      </w:r>
+      <w:r>
+        <w:t>.</w:t>
+      </w:r>
+    </w:p>
+    <w:p>
+      <w:pPr>
+        <w:pStyle w:val="ab"/>
+      </w:pPr>
+      <w:r>
+        <w:t>Для построения интернет-приложения была выбрана клиент-серверная модель. Клиент-серверная архитектура — это подход к организации вычислительных систем, при котором функции разделены между поставщиком услуг (сервером) и потребителем (клиентом). Клиент отвечает за отображение интерфейса и передачу действий пользователя, а сервер обрабатывает запросы, хранит данные и выполняет логические операции, включая работу алгоритмов подбора подарков.</w:t>
+      </w:r>
+    </w:p>
+    <w:p>
+      <w:pPr>
+        <w:pStyle w:val="ab"/>
+      </w:pPr>
+      <w:r>
+        <w:t>Выбор данной архитектуры обоснован следующими факторами:</w:t>
+      </w:r>
+    </w:p>
+    <w:p>
+      <w:pPr>
+        <w:pStyle w:val="ab"/>
+        <w:numPr>
+          <w:ilvl w:val="0"/>
+          <w:numId w:val="41"/>
+        </w:numPr>
+      </w:pPr>
+      <w:r>
+        <w:t>Безопасность данных</w:t>
+      </w:r>
+      <w:r>
+        <w:t>.</w:t>
+      </w:r>
+      <w:r>
+        <w:t xml:space="preserve"> Основная логика работы и хранение информации о подарках и предпочтениях пользователей сосредоточены на </w:t>
+      </w:r>
+      <w:r>
+        <w:lastRenderedPageBreak/>
+        <w:t>сервере, что защищает данные от несанкционированного доступа и модификации со стороны клиента.</w:t>
+      </w:r>
+    </w:p>
+    <w:p>
+      <w:pPr>
+        <w:pStyle w:val="ab"/>
+        <w:numPr>
+          <w:ilvl w:val="0"/>
+          <w:numId w:val="41"/>
+        </w:numPr>
+      </w:pPr>
+      <w:r>
+        <w:t>Масштабируемость и производительность</w:t>
+      </w:r>
+      <w:r>
+        <w:t>.</w:t>
+      </w:r>
+      <w:r>
+        <w:t xml:space="preserve"> </w:t>
+      </w:r>
+      <w:r>
+        <w:t>С</w:t>
+      </w:r>
+      <w:r>
+        <w:t>ложные задачи</w:t>
+      </w:r>
+      <w:r>
+        <w:t xml:space="preserve"> для вычислений</w:t>
+      </w:r>
+      <w:r>
+        <w:t>, такие как генерация идей и анализ интересов, выполняются на стороне сервера. Это позволяет использовать ресурсоемкие алгоритмы рекомендаций без нагрузки на устройства пользователей, обеспечивая быструю работу даже на мобильных гаджетах.</w:t>
+      </w:r>
+    </w:p>
+    <w:p>
+      <w:pPr>
+        <w:pStyle w:val="ab"/>
+        <w:numPr>
+          <w:ilvl w:val="0"/>
+          <w:numId w:val="41"/>
+        </w:numPr>
+      </w:pPr>
+      <w:r>
+        <w:t>Кроссплатформенность</w:t>
+      </w:r>
+      <w:r>
+        <w:t>.</w:t>
+      </w:r>
+      <w:r>
+        <w:t xml:space="preserve"> Разделение на клиент и сервер позволяет создать единый программный модуль, который может быть подключен к различным платформам через стандартные протоколы обмена данными. Пользователь получает доступ к одному и тому же функционалу независимо от устройства входа.</w:t>
+      </w:r>
+    </w:p>
+    <w:p>
+      <w:pPr>
+        <w:pStyle w:val="ab"/>
+      </w:pPr>
+      <w:r>
+        <w:t>Система базируется на сервере, который обрабатывает входящие запросы от клиентов, управляет состоянием списков подарков, фиксирует брони и взаимодействует с модулем интеллектуальной обработки для формирования рекомендаций. Здесь реализуется вся ключевая бизнес-логика приложения.</w:t>
+      </w:r>
+    </w:p>
+    <w:p>
+      <w:pPr>
+        <w:pStyle w:val="ab"/>
+      </w:pPr>
+      <w:r>
+        <w:t>Клиентская часть представляет собой интерфейс, через который пользователь взаимодействует с системой. Она отображает списки, карточки подарков, результаты работы алгоритмов подбора и позволяет управлять своими предпочтениями. Такой подход обеспечивает удобство использования, быстрый отклик интерфейса и возможность оперативного обновления визуальной части без изменения серверной логики.</w:t>
+      </w:r>
+    </w:p>
+    <w:p>
+      <w:pPr>
+        <w:pStyle w:val="ab"/>
+        <w:spacing w:before="240"/>
+      </w:pPr>
+      <w:r>
+        <w:t>3. Инструменты создания веб-приложения</w:t>
+      </w:r>
+    </w:p>
+    <w:p>
+      <w:pPr>
+        <w:pStyle w:val="ab"/>
+      </w:pPr>
+      <w:r>
+        <w:t>Для реализации серверной части интернет-приложения выбран язык программирования Python версии 3.10 или выше. Выбор данного языка обусловлен несколькими ключевыми факторами, критичными для разрабатываемой системы:</w:t>
+      </w:r>
+    </w:p>
+    <w:p>
+      <w:pPr>
+        <w:pStyle w:val="ab"/>
+      </w:pPr>
+      <w:r>
+        <w:t xml:space="preserve">Интеграция с интеллектуальным модулем. Поскольку ядром проекта является система рекомендаций и генерации идей подарков, использование единого </w:t>
+      </w:r>
+      <w:r>
+        <w:lastRenderedPageBreak/>
+        <w:t>языка программирования для веб-сервера и модуля искусственного интеллекта значительно упрощает архитектуру. Это позволяет напрямую импортировать библиотеки машинного обучения (такие как scikit-learn, pandas, numpy) в основной код приложения или организовать эффективное межпроцессное взаимодействие без необходимости создания сложных сетевых шлюзов между разнородными средами (например, между Node.js и Python).</w:t>
+      </w:r>
+    </w:p>
+    <w:p>
+      <w:pPr>
+        <w:pStyle w:val="ab"/>
+      </w:pPr>
+      <w:r>
+        <w:t>Экосистема для работы с данными. Python обладает наиболее развитой экосистемой библиотек для анализа данных и обработки естественного языка (NLP), что необходимо для реализации функций анализа интересов пользователей и семантического поиска подарков.</w:t>
+      </w:r>
+    </w:p>
+    <w:p>
+      <w:pPr>
+        <w:pStyle w:val="ab"/>
+      </w:pPr>
+      <w:r>
+        <w:t>Скорость разработки и читаемость. Высокий уровень абстракции и лаконичный синтаксис Python позволяют быстро реализовывать сложную бизнес-логику, такую как управление статусами бронирования и алгоритмы распределения затрат, снижая вероятность ошибок при разработке.</w:t>
+      </w:r>
+    </w:p>
+    <w:p>
+      <w:pPr>
+        <w:pStyle w:val="ab"/>
+      </w:pPr>
+      <w:r>
+        <w:t>В качестве основного веб-фреймворка для построения API выбран FastAPI. Это современный высокопроизводительный фреймворк для создания веб-приложений на основе стандартов Python 3.6+.</w:t>
+      </w:r>
+    </w:p>
+    <w:p>
+      <w:pPr>
+        <w:pStyle w:val="ab"/>
+      </w:pPr>
+      <w:r>
+        <w:t>FastAPI поддерживает асинхронный ввод-вывод (async/await), что позволяет серверу эффективно обрабатывать большое количество одновременных подключений от клиентов. Это особенно важно при выполнении длительных операций, таких как запросы к базе данных или ожидание ответов от алгоритмов рекомендательной системы, не блокируя обработку других пользовательских запросов.</w:t>
+      </w:r>
+    </w:p>
+    <w:p>
+      <w:pPr>
+        <w:pStyle w:val="ab"/>
+      </w:pPr>
+      <w:r>
+        <w:t>Фреймворк автоматически генерирует интерактивную документацию API (на базе Swagger UI и ReDoc) непосредственно из кода. Это ускоряет процесс разработки клиентской части, так как фронтенд-разработчик всегда имеет актуальное описание всех доступных эндпоинтов, форматов запросов и ответов.</w:t>
+      </w:r>
+    </w:p>
+    <w:p>
+      <w:pPr>
+        <w:pStyle w:val="ab"/>
+      </w:pPr>
+      <w:r>
+        <w:t xml:space="preserve">Благодаря встроенной поддержке библиотеки Pydantic, FastAPI обеспечивает строгую типизацию и автоматическую валидацию входящих и исходящих данных. Это гарантирует, что информация о подарках, пользователях и списках </w:t>
+      </w:r>
+      <w:r>
+        <w:lastRenderedPageBreak/>
+        <w:t>будет соответствовать ожидаемой структуре, предотвращая ошибки на уровне базы данных и повышая общую надежность системы.</w:t>
+      </w:r>
+    </w:p>
+    <w:p>
+      <w:pPr>
+        <w:pStyle w:val="ab"/>
+      </w:pPr>
+      <w:r>
+        <w:t>Благодаря использованию движка Starlette и поддержке асинхронности, FastAPI демонстрирует показатели производительности, сопоставимые с высоконагруженными решениями на Node.js или Go, что делает его подходящим выбором для проектов с требованием масштабируемости [].</w:t>
+      </w:r>
+    </w:p>
+    <w:p>
+      <w:pPr>
+        <w:pStyle w:val="ab"/>
+      </w:pPr>
+      <w:r>
+        <w:t>Для взаимодействия с базой данных выбрана библиотека SQLAlchemy, являющаяся одной из самых популярных ORM (Object-Relational Mapping) систем для Python. Она позволяет работать с данными базы как с объектами языка программирования, скрывая сложные SQL-запросы внутри кода.</w:t>
+      </w:r>
+    </w:p>
+    <w:p>
+      <w:pPr>
+        <w:pStyle w:val="ab"/>
+      </w:pPr>
+      <w:r>
+        <w:t xml:space="preserve">Использование SQLAlchemy упрощает разработку, делая код более читаемым и поддерживаемым. Поддержка асинхронного режима критически важна для </w:t>
+      </w:r>
+      <w:r>
+        <w:t>интеллектуальной системы</w:t>
+      </w:r>
+      <w:r>
+        <w:t>, так как позволяет серверу обрабатывать запросы к базе данных без блокировки выполнения других операций, что повышает общую пропускную способность системы при работе с рекомендательным модулем.</w:t>
+      </w:r>
+    </w:p>
+    <w:p>
+      <w:pPr>
+        <w:pStyle w:val="ab"/>
+      </w:pPr>
+      <w:r>
+        <w:t>В паре с SQLAlchemy используется инструмент миграции баз данных Alembic. Он предназначен для управления изменениями в структуре базы данных в процессе разработки и эксплуатации.</w:t>
+      </w:r>
+    </w:p>
+    <w:p>
+      <w:pPr>
+        <w:pStyle w:val="ab"/>
+      </w:pPr>
+      <w:r>
+        <w:t>Alembic позволяет версионировать структуру базы данных, автоматически создавая скрипты для обновления схемы. Это гарантирует целостность данных при переходе между версиями приложения и упрощает развертывание проекта на разных серверах.</w:t>
+      </w:r>
+    </w:p>
+    <w:p>
+      <w:pPr>
+        <w:pStyle w:val="ab"/>
+      </w:pPr>
+      <w:r>
+        <w:t>Для валидации входящих и исходящих данных используется библиотека Pydantic. Она позволяет описывать структуры данных с помощью типов Python и автоматически проверять их соответствие при получении запросов от клиента.</w:t>
+      </w:r>
+      <w:r>
+        <w:t xml:space="preserve"> </w:t>
+      </w:r>
+      <w:r>
+        <w:t>Строгая типизация данных снижает количество ошибок, связанных с некорректным форматом информации.</w:t>
+      </w:r>
+    </w:p>
+    <w:p>
+      <w:pPr>
+        <w:pStyle w:val="ab"/>
+      </w:pPr>
+      <w:r>
+        <w:t xml:space="preserve">Библиотека Passlib предоставляет унифицированный интерфейс для работы с различными алгоритмами хеширования, однако для защиты критически </w:t>
+      </w:r>
+      <w:r>
+        <w:lastRenderedPageBreak/>
+        <w:t>важных данных в разрабатываемой системе (токенов доступа, секретных ключей интеграции с внешними API) выбран алгоритм bcrypt. Данный выбор обусловлен высокой устойчивостью bcrypt к атакам полного перебора (brute-force) и использованию радужных таблиц.</w:t>
+      </w:r>
+    </w:p>
+    <w:p>
+      <w:pPr>
+        <w:pStyle w:val="ab"/>
+      </w:pPr>
+      <w:r>
+        <w:t>Принцип работы алгоритма bcrypt основан на адаптивной функции хеширования, использующей модифицированный алгоритм шифрования Blowfish. Входными данными для функции являются:</w:t>
+      </w:r>
+    </w:p>
+    <w:p>
+      <w:pPr>
+        <w:pStyle w:val="ab"/>
+        <w:numPr>
+          <w:ilvl w:val="0"/>
+          <w:numId w:val="42"/>
+        </w:numPr>
+      </w:pPr>
+      <w:r>
+        <w:t>Строка исходных данных (например, токен или ключ), длина которой ограничена 72 байтами.</w:t>
+      </w:r>
+    </w:p>
+    <w:p>
+      <w:pPr>
+        <w:pStyle w:val="ab"/>
+        <w:numPr>
+          <w:ilvl w:val="0"/>
+          <w:numId w:val="42"/>
+        </w:numPr>
+      </w:pPr>
+      <w:r>
+        <w:t>Параметр сложности (cost), определяющий количество раундов вычислений (</w:t>
+      </w:r>
+      <w:r>
+        <w:t>2</w:t>
+      </w:r>
+      <w:r>
+        <w:rPr>
+          <w:vertAlign w:val="superscript"/>
+          <w:lang w:val="en-US"/>
+        </w:rPr>
+        <w:t>cost</w:t>
+      </w:r>
+      <w:r>
+        <w:t>).</w:t>
+      </w:r>
+    </w:p>
+    <w:p>
+      <w:pPr>
+        <w:pStyle w:val="ab"/>
+        <w:numPr>
+          <w:ilvl w:val="0"/>
+          <w:numId w:val="42"/>
+        </w:numPr>
+      </w:pPr>
+      <w:r>
+        <w:t>Случайное значение «соли» (salt) длиной 16 байт (128 бит), генерируемое криптографически стойким генератором случайных чисел для каждого уникального хеша.</w:t>
+      </w:r>
+    </w:p>
+    <w:p>
+      <w:pPr>
+        <w:pStyle w:val="ab"/>
+      </w:pPr>
+      <w:r>
+        <w:t>На выходе алгоритм формирует хеш длиной 24 байта (192 бита). Конечная строка результата имеет строго определенную структуру:</w:t>
+      </w:r>
+    </w:p>
+    <w:p>
+      <w:pPr>
+        <w:pStyle w:val="ab"/>
+        <w:rPr>
+          <w:lang w:val="en-US"/>
+        </w:rPr>
+      </w:pPr>
+      <w:r>
+        <w:rPr>
+          <w:lang w:val="en-US"/>
+        </w:rPr>
+        <w:t>$2&lt;</w:t>
+      </w:r>
+      <w:r>
+        <w:rPr>
+          <w:lang w:val="en-US"/>
+        </w:rPr>
+        <w:t>a</w:t>
+      </w:r>
+      <w:r>
+        <w:rPr>
+          <w:lang w:val="en-US"/>
+        </w:rPr>
+        <w:t>/</w:t>
+      </w:r>
+      <w:r>
+        <w:rPr>
+          <w:lang w:val="en-US"/>
+        </w:rPr>
+        <w:t>b</w:t>
+      </w:r>
+      <w:r>
+        <w:rPr>
+          <w:lang w:val="en-US"/>
+        </w:rPr>
+        <w:t>/</w:t>
+      </w:r>
+      <w:r>
+        <w:rPr>
+          <w:lang w:val="en-US"/>
+        </w:rPr>
+        <w:t>x</w:t>
+      </w:r>
+      <w:r>
+        <w:rPr>
+          <w:lang w:val="en-US"/>
+        </w:rPr>
+        <w:t>/</w:t>
+      </w:r>
+      <w:r>
+        <w:rPr>
+          <w:lang w:val="en-US"/>
+        </w:rPr>
+        <w:t>y</w:t>
+      </w:r>
+      <w:r>
+        <w:rPr>
+          <w:lang w:val="en-US"/>
+        </w:rPr>
+        <w:t>&gt;$[</w:t>
+      </w:r>
+      <w:r>
+        <w:rPr>
+          <w:lang w:val="en-US"/>
+        </w:rPr>
+        <w:t>cost</w:t>
+      </w:r>
+      <w:r>
+        <w:rPr>
+          <w:lang w:val="en-US"/>
+        </w:rPr>
+        <w:t xml:space="preserve">]$(22 </w:t>
+      </w:r>
+      <w:r>
+        <w:rPr>
+          <w:lang w:val="en-US"/>
+        </w:rPr>
+        <w:t>character</w:t>
+      </w:r>
+      <w:r>
+        <w:rPr>
+          <w:lang w:val="en-US"/>
+        </w:rPr>
+        <w:t xml:space="preserve"> </w:t>
+      </w:r>
+      <w:r>
+        <w:rPr>
+          <w:lang w:val="en-US"/>
+        </w:rPr>
+        <w:t>salt</w:t>
+      </w:r>
+      <w:r>
+        <w:rPr>
+          <w:lang w:val="en-US"/>
+        </w:rPr>
+        <w:t xml:space="preserve">)(31 </w:t>
+      </w:r>
+      <w:r>
+        <w:rPr>
+          <w:lang w:val="en-US"/>
+        </w:rPr>
+        <w:t>character</w:t>
+      </w:r>
+      <w:r>
+        <w:rPr>
+          <w:lang w:val="en-US"/>
+        </w:rPr>
+        <w:t xml:space="preserve"> </w:t>
+      </w:r>
+      <w:r>
+        <w:rPr>
+          <w:lang w:val="en-US"/>
+        </w:rPr>
+        <w:t>hash</w:t>
+      </w:r>
+      <w:r>
+        <w:rPr>
+          <w:lang w:val="en-US"/>
+        </w:rPr>
+        <w:t>)</w:t>
+      </w:r>
+    </w:p>
+    <w:p>
+      <w:pPr>
+        <w:pStyle w:val="ab"/>
+      </w:pPr>
+      <w:r>
+        <w:t xml:space="preserve">Например, при вводе пароля abc123xyz, </w:t>
+      </w:r>
+      <w:r>
+        <w:rPr>
+          <w:lang w:val="en-US"/>
+        </w:rPr>
+        <w:t>cost</w:t>
+      </w:r>
+      <w:r>
+        <w:t xml:space="preserve"> 12 и случайной </w:t>
+      </w:r>
+      <w:r>
+        <w:rPr>
+          <w:lang w:val="en-US"/>
+        </w:rPr>
+        <w:t>salt</w:t>
+      </w:r>
+      <w:r>
+        <w:t xml:space="preserve"> результатом работы </w:t>
+      </w:r>
+      <w:r>
+        <w:rPr>
+          <w:lang w:val="en-US"/>
+        </w:rPr>
+        <w:t>bcrypt</w:t>
+      </w:r>
+      <w:r>
+        <w:t xml:space="preserve"> </w:t>
+      </w:r>
+      <w:r>
+        <w:t>будет строка</w:t>
+      </w:r>
+      <w:r>
+        <w:t>:</w:t>
+      </w:r>
+    </w:p>
+    <w:p>
+      <w:pPr>
+        <w:pStyle w:val="ab"/>
+        <w:keepNext/>
+        <w:ind w:firstLine="0"/>
+        <w:jc w:val="center"/>
+        <w:rPr>
+          <w:rFonts w:cs="Times New Roman"/>
+        </w:rPr>
+      </w:pPr>
+      <w:r>
+        <w:rPr>
+          <w:rFonts w:cs="Times New Roman"/>
+          <w:noProof/>
+        </w:rPr>
+        <w:drawing>
+          <wp:inline distT="0" distB="0" distL="0" distR="0" wp14:anchorId="45BC72DC" wp14:editId="698F4400">
+            <wp:extent cx="4514286" cy="571429"/>
+            <wp:effectExtent l="0" t="0" r="635" b="635"/>
+            <wp:docPr id="6" name="Рисунок 6"/>
+            <wp:cNvGraphicFramePr>
+              <a:graphicFrameLocks xmlns:a="http://schemas.openxmlformats.org/drawingml/2006/main" noChangeAspect="1"/>
+            </wp:cNvGraphicFramePr>
+            <a:graphic xmlns:a="http://schemas.openxmlformats.org/drawingml/2006/main">
+              <a:graphicData uri="http://schemas.openxmlformats.org/drawingml/2006/picture">
+                <pic:pic xmlns:pic="http://schemas.openxmlformats.org/drawingml/2006/picture">
+                  <pic:nvPicPr>
+                    <pic:cNvPr id="1" name=""/>
+                    <pic:cNvPicPr/>
+                  </pic:nvPicPr>
+                  <pic:blipFill>
+                    <a:blip r:embed="rId13"/>
+                    <a:stretch>
+                      <a:fillRect/>
+                    </a:stretch>
+                  </pic:blipFill>
+                  <pic:spPr>
+                    <a:xfrm>
+                      <a:off x="0" y="0"/>
+                      <a:ext cx="4514286" cy="571429"/>
+                    </a:xfrm>
+                    <a:prstGeom prst="rect">
+                      <a:avLst/>
+                    </a:prstGeom>
+                  </pic:spPr>
+                </pic:pic>
+              </a:graphicData>
+            </a:graphic>
+          </wp:inline>
+        </w:drawing>
+      </w:r>
+    </w:p>
+    <w:p>
+      <w:pPr>
+        <w:pStyle w:val="ab"/>
+        <w:ind w:firstLine="0"/>
+        <w:jc w:val="center"/>
+        <w:rPr>
+          <w:lang w:val="en-US"/>
+        </w:rPr>
+      </w:pPr>
+      <w:r>
+        <w:t xml:space="preserve">Рис. </w:t>
+      </w:r>
+      <w:r>
+        <w:fldChar w:fldCharType="begin"/>
+      </w:r>
+      <w:r>
+        <w:instrText xml:space="preserve"> SEQ Рис. \* ARABIC </w:instrText>
+      </w:r>
+      <w:r>
+        <w:fldChar w:fldCharType="separate"/>
+      </w:r>
+      <w:r>
+        <w:rPr>
+          <w:noProof/>
+        </w:rPr>
+        <w:t>5</w:t>
+      </w:r>
+      <w:r>
+        <w:fldChar w:fldCharType="end"/>
+      </w:r>
+      <w:r>
+        <w:t xml:space="preserve">. Пример работы </w:t>
+      </w:r>
+      <w:r>
+        <w:rPr>
+          <w:lang w:val="en-US"/>
+        </w:rPr>
+        <w:t>bcrypt</w:t>
+      </w:r>
+    </w:p>
+    <w:p>
+      <w:pPr>
+        <w:pStyle w:val="ab"/>
+      </w:pPr>
+      <w:r>
+        <w:t>Где:</w:t>
+      </w:r>
+    </w:p>
+    <w:p>
+      <w:pPr>
+        <w:pStyle w:val="ab"/>
+        <w:numPr>
+          <w:ilvl w:val="0"/>
+          <w:numId w:val="13"/>
+        </w:numPr>
+      </w:pPr>
+      <w:r>
+        <w:t>$2a$: Идентификатор алгоритма хэширования (</w:t>
+      </w:r>
+      <w:r>
+        <w:rPr>
+          <w:lang w:val="en-US"/>
+        </w:rPr>
+        <w:t>bcrypt</w:t>
+      </w:r>
+      <w:r>
+        <w:t>)</w:t>
+      </w:r>
+    </w:p>
+    <w:p>
+      <w:pPr>
+        <w:pStyle w:val="ab"/>
+        <w:numPr>
+          <w:ilvl w:val="0"/>
+          <w:numId w:val="13"/>
+        </w:numPr>
+      </w:pPr>
+      <w:r>
+        <w:t xml:space="preserve">12: Стоимость </w:t>
+      </w:r>
+      <w:r>
+        <w:t>(</w:t>
+      </w:r>
+      <w:r>
+        <w:rPr>
+          <w:lang w:val="en-US"/>
+        </w:rPr>
+        <w:t>cost</w:t>
+      </w:r>
+      <w:r>
+        <w:t>) ввода (2</w:t>
+      </w:r>
+      <w:r>
+        <w:rPr>
+          <w:vertAlign w:val="superscript"/>
+        </w:rPr>
+        <w:t>12</w:t>
+      </w:r>
+      <w:r>
+        <w:t>, т.е. 4096 раундов)</w:t>
+      </w:r>
+    </w:p>
+    <w:p>
+      <w:pPr>
+        <w:pStyle w:val="ab"/>
+        <w:numPr>
+          <w:ilvl w:val="0"/>
+          <w:numId w:val="13"/>
+        </w:numPr>
+      </w:pPr>
+      <w:r>
+        <w:t>R9h/cIPz0gi.URNNX3kh2O: Кодировка входного значения по стандарту base-64</w:t>
+      </w:r>
+    </w:p>
+    <w:p>
+      <w:pPr>
+        <w:pStyle w:val="ab"/>
+        <w:numPr>
+          <w:ilvl w:val="0"/>
+          <w:numId w:val="13"/>
+        </w:numPr>
+      </w:pPr>
+      <w:r>
+        <w:t>PST9/PgBkqquzi.Ss7KIUgO2t0jWMUW: Кодировка по стандарту 64 для первых 23 байт вычисленного 24-байтового хэша</w:t>
+      </w:r>
+    </w:p>
+    <w:p>
+      <w:pPr>
+        <w:pStyle w:val="ab"/>
+      </w:pPr>
+      <w:r>
+        <w:lastRenderedPageBreak/>
+        <w:t>Кодировка base-64 в bcrypt использует таблицу «./ABCDEFGHIJKLMNOPQRSTUVWXYZabcdefghijklmnopqrstuvwxyz0123456789», которая отличается от кодировки Base64 в RFC 4648. []</w:t>
+      </w:r>
+    </w:p>
+    <w:p>
+      <w:pPr>
+        <w:pStyle w:val="ab"/>
+        <w:spacing w:before="240"/>
+        <w:rPr>
+          <w:lang w:val="en-US"/>
+        </w:rPr>
+      </w:pPr>
+      <w:r>
+        <w:t>PyJWT (Python JSON Web Token)</w:t>
+      </w:r>
+      <w:r>
+        <w:t xml:space="preserve"> </w:t>
+      </w:r>
+      <w:r>
+        <w:t>реализует стандарт RFC 7519, позволяющий создавать компактные токены</w:t>
+      </w:r>
+      <w:r>
+        <w:t xml:space="preserve"> доступа, основанных на формате JSON.</w:t>
+      </w:r>
+      <w:r>
+        <w:t xml:space="preserve"> </w:t>
+      </w:r>
+      <w:r>
+        <w:t>PyJWT</w:t>
+      </w:r>
+      <w:r>
+        <w:t xml:space="preserve"> </w:t>
+      </w:r>
+      <w:r>
+        <w:t>состоит из трех основных компонентов: заголовка (</w:t>
+      </w:r>
+      <w:r>
+        <w:rPr>
+          <w:lang w:val="en-US"/>
+        </w:rPr>
+        <w:t>header</w:t>
+      </w:r>
+      <w:r>
+        <w:t>), полезной нагрузки (</w:t>
+      </w:r>
+      <w:r>
+        <w:rPr>
+          <w:lang w:val="en-US"/>
+        </w:rPr>
+        <w:t>payload</w:t>
+      </w:r>
+      <w:r>
+        <w:t>) и подписи (</w:t>
+      </w:r>
+      <w:r>
+        <w:rPr>
+          <w:lang w:val="en-US"/>
+        </w:rPr>
+        <w:t>signature</w:t>
+      </w:r>
+      <w:r>
+        <w:t>), разделенных точками. Заголовок содержит информацию о типе токена и используемом алгоритме, а полезная нагрузка может содержать информацию о пользователе или другие данные. Подпись используется для верификации целостности и подлинности токена</w:t>
+      </w:r>
+      <w:r>
+        <w:t>.</w:t>
+      </w:r>
+      <w:r>
+        <w:rPr>
+          <w:lang w:val="en-US"/>
+        </w:rPr>
+        <w:t xml:space="preserve"> []</w:t>
+      </w:r>
+    </w:p>
+    <w:p>
+      <w:pPr>
+        <w:pStyle w:val="ab"/>
+        <w:keepNext/>
+        <w:ind w:firstLine="0"/>
+        <w:jc w:val="center"/>
+      </w:pPr>
+      <w:r>
+        <w:rPr>
+          <w:noProof/>
+        </w:rPr>
+        <w:drawing>
+          <wp:inline distT="0" distB="0" distL="0" distR="0" wp14:anchorId="3129180B" wp14:editId="108C18BE">
+            <wp:extent cx="5830784" cy="2880625"/>
+            <wp:effectExtent l="0" t="0" r="0" b="0"/>
+            <wp:docPr id="7" name="Рисунок 7"/>
+            <wp:cNvGraphicFramePr>
+              <a:graphicFrameLocks xmlns:a="http://schemas.openxmlformats.org/drawingml/2006/main" noChangeAspect="1"/>
+            </wp:cNvGraphicFramePr>
+            <a:graphic xmlns:a="http://schemas.openxmlformats.org/drawingml/2006/main">
+              <a:graphicData uri="http://schemas.openxmlformats.org/drawingml/2006/picture">
+                <pic:pic xmlns:pic="http://schemas.openxmlformats.org/drawingml/2006/picture">
+                  <pic:nvPicPr>
+                    <pic:cNvPr id="1" name=""/>
+                    <pic:cNvPicPr/>
+                  </pic:nvPicPr>
+                  <pic:blipFill>
+                    <a:blip r:embed="rId14"/>
+                    <a:stretch>
+                      <a:fillRect/>
+                    </a:stretch>
+                  </pic:blipFill>
+                  <pic:spPr>
+                    <a:xfrm>
+                      <a:off x="0" y="0"/>
+                      <a:ext cx="5847098" cy="2888685"/>
+                    </a:xfrm>
+                    <a:prstGeom prst="rect">
+                      <a:avLst/>
+                    </a:prstGeom>
+                  </pic:spPr>
+                </pic:pic>
+              </a:graphicData>
+            </a:graphic>
+          </wp:inline>
+        </w:drawing>
+      </w:r>
+    </w:p>
+    <w:p>
+      <w:pPr>
+        <w:pStyle w:val="affa"/>
+      </w:pPr>
+      <w:r>
+        <w:t xml:space="preserve">Рис. </w:t>
+      </w:r>
+      <w:r>
+        <w:fldChar w:fldCharType="begin"/>
+      </w:r>
+      <w:r>
+        <w:instrText xml:space="preserve"> SEQ Рис. \* ARABIC </w:instrText>
+      </w:r>
+      <w:r>
+        <w:fldChar w:fldCharType="separate"/>
+      </w:r>
+      <w:r>
+        <w:rPr>
+          <w:noProof/>
+        </w:rPr>
+        <w:t>6</w:t>
+      </w:r>
+      <w:r>
+        <w:rPr>
+          <w:noProof/>
+        </w:rPr>
+        <w:fldChar w:fldCharType="end"/>
+      </w:r>
+      <w:r>
+        <w:t xml:space="preserve"> - </w:t>
+      </w:r>
+      <w:r>
+        <w:t xml:space="preserve">Устройство </w:t>
+      </w:r>
+      <w:r>
+        <w:rPr>
+          <w:lang w:val="en-US"/>
+        </w:rPr>
+        <w:t>JWT</w:t>
+      </w:r>
+    </w:p>
+    <w:p>
+      <w:pPr>
+        <w:pStyle w:val="ab"/>
+      </w:pPr>
+      <w:r>
+        <w:t xml:space="preserve">Подпись или же секретный ключ должен знать только сервер, который шифрует и дешифрует данные. Модуль </w:t>
+      </w:r>
+      <w:r>
+        <w:rPr>
+          <w:lang w:val="en-US"/>
+        </w:rPr>
+        <w:t>JWT</w:t>
+      </w:r>
+      <w:r>
+        <w:t xml:space="preserve"> складывает вместе заголовок с данными и шифрует с помощью секретного ключа.</w:t>
+      </w:r>
+    </w:p>
+    <w:p>
+      <w:pPr>
+        <w:pStyle w:val="ab"/>
+      </w:pPr>
+      <w:r>
+        <w:t xml:space="preserve">Существуют 2 вида </w:t>
+      </w:r>
+      <w:r>
+        <w:rPr>
+          <w:lang w:val="en-US"/>
+        </w:rPr>
+        <w:t>JWT</w:t>
+      </w:r>
+      <w:r>
+        <w:t xml:space="preserve"> </w:t>
+      </w:r>
+      <w:r>
+        <w:t xml:space="preserve">токенов: </w:t>
+      </w:r>
+    </w:p>
+    <w:p>
+      <w:pPr>
+        <w:pStyle w:val="ab"/>
+        <w:numPr>
+          <w:ilvl w:val="0"/>
+          <w:numId w:val="14"/>
+        </w:numPr>
+        <w:ind w:left="1134" w:hanging="425"/>
+      </w:pPr>
+      <w:r>
+        <w:rPr>
+          <w:lang w:val="en-US"/>
+        </w:rPr>
+        <w:t>access</w:t>
+      </w:r>
+      <w:r>
+        <w:t xml:space="preserve"> (</w:t>
+      </w:r>
+      <w:r>
+        <w:t>токен доступа</w:t>
+      </w:r>
+      <w:r>
+        <w:t>)</w:t>
+      </w:r>
+      <w:r>
+        <w:t xml:space="preserve"> - существует малое количество времени, требуется для подтверждения авторизации, без требования заходить в систему снова. Храниться локально в браузере</w:t>
+      </w:r>
+    </w:p>
+    <w:p>
+      <w:pPr>
+        <w:pStyle w:val="ab"/>
+        <w:numPr>
+          <w:ilvl w:val="0"/>
+          <w:numId w:val="14"/>
+        </w:numPr>
+        <w:ind w:left="1134" w:hanging="425"/>
+      </w:pPr>
+      <w:r>
+        <w:rPr>
+          <w:lang w:val="en-US"/>
+        </w:rPr>
+        <w:lastRenderedPageBreak/>
+        <w:t>refresh</w:t>
+      </w:r>
+      <w:r>
+        <w:t xml:space="preserve"> (</w:t>
+      </w:r>
+      <w:r>
+        <w:t>токен обновления</w:t>
+      </w:r>
+      <w:r>
+        <w:t>)</w:t>
+      </w:r>
+      <w:r>
+        <w:t xml:space="preserve"> – существует вплоть до несколько месяцев, позволяет обновлять </w:t>
+      </w:r>
+      <w:r>
+        <w:rPr>
+          <w:lang w:val="en-US"/>
+        </w:rPr>
+        <w:t>access</w:t>
+      </w:r>
+      <w:r>
+        <w:t xml:space="preserve"> </w:t>
+      </w:r>
+      <w:r>
+        <w:t>токен. Если пользователь не заходит в систему в течении определенного количества дней, то ему потребуется авторизоваться вновь. Храниться в</w:t>
+      </w:r>
+      <w:r>
+        <w:rPr>
+          <w:lang w:val="en-US"/>
+        </w:rPr>
+        <w:t xml:space="preserve"> httpOnly</w:t>
+      </w:r>
+      <w:r>
+        <w:t xml:space="preserve"> </w:t>
+      </w:r>
+      <w:r>
+        <w:rPr>
+          <w:lang w:val="en-US"/>
+        </w:rPr>
+        <w:t>cookie</w:t>
+      </w:r>
+      <w:r>
+        <w:t>.</w:t>
+      </w:r>
+    </w:p>
+    <w:p>
+      <w:pPr>
+        <w:pStyle w:val="ab"/>
+      </w:pPr>
+      <w:r>
+        <w:t>Такое разделение на токены обеспечивает безопасность аккаунтов, так как воруя токен доступа, он существует малое количество времени и получить доступ к системе не получится.</w:t>
+      </w:r>
+    </w:p>
+    <w:p>
+      <w:pPr>
+        <w:pStyle w:val="ab"/>
+      </w:pPr>
+      <w:r>
+        <w:t xml:space="preserve">Таким образом, </w:t>
+      </w:r>
+      <w:r>
+        <w:t xml:space="preserve">JWT представляет собой удобный инструмент для безопасной передачи информации и </w:t>
+      </w:r>
+      <w:bookmarkStart w:id="80" w:name="_Hlk167230692"/>
+      <w:r>
+        <w:t xml:space="preserve">аутентификации </w:t>
+      </w:r>
+      <w:bookmarkEnd w:id="80"/>
+      <w:r>
+        <w:t>в веб-приложениях, обеспечивая проверку подлинности данных, целостность и защиту от подделок</w:t>
+      </w:r>
+      <w:r>
+        <w:t>.</w:t>
+      </w:r>
+    </w:p>
+    <w:p>
+      <w:pPr>
+        <w:pStyle w:val="ab"/>
+      </w:pPr>
+    </w:p>
+    <w:p>
+      <w:pPr>
+        <w:pStyle w:val="ab"/>
+        <w:ind w:firstLine="0"/>
+        <w:jc w:val="center"/>
+      </w:pPr>
+    </w:p>
     <w:sectPr>
-      <w:footerReference w:type="default" r:id="rId13"/>
+      <w:footerReference w:type="default" r:id="rId15"/>
       <w:pgSz w:w="11906" w:h="16838" w:code="9"/>
       <w:pgMar w:top="1134" w:right="567" w:bottom="1134" w:left="1701" w:header="709" w:footer="709" w:gutter="0"/>
       <w:cols w:space="708"/>
@@ -1891,7 +2963,7 @@
         <w:ind w:left="1429" w:hanging="360"/>
       </w:pPr>
     </w:lvl>
-    <w:lvl w:ilvl="1" w:tplc="04190019" w:tentative="1">
+    <w:lvl w:ilvl="1" w:tplc="04190019">
       <w:start w:val="1"/>
       <w:numFmt w:val="lowerLetter"/>
       <w:lvlText w:val="%2."/>
@@ -2940,6 +4012,119 @@
     </w:lvl>
   </w:abstractNum>
   <w:abstractNum w:abstractNumId="11" w15:restartNumberingAfterBreak="0">
+    <w:nsid w:val="197722B9"/>
+    <w:multiLevelType w:val="hybridMultilevel"/>
+    <w:tmpl w:val="75EE8530"/>
+    <w:lvl w:ilvl="0" w:tplc="04190001">
+      <w:start w:val="1"/>
+      <w:numFmt w:val="bullet"/>
+      <w:lvlText w:val=""/>
+      <w:lvlJc w:val="left"/>
+      <w:pPr>
+        <w:ind w:left="1429" w:hanging="360"/>
+      </w:pPr>
+      <w:rPr>
+        <w:rFonts w:ascii="Symbol" w:hAnsi="Symbol" w:hint="default"/>
+      </w:rPr>
+    </w:lvl>
+    <w:lvl w:ilvl="1" w:tplc="04190003" w:tentative="1">
+      <w:start w:val="1"/>
+      <w:numFmt w:val="bullet"/>
+      <w:lvlText w:val="o"/>
+      <w:lvlJc w:val="left"/>
+      <w:pPr>
+        <w:ind w:left="2149" w:hanging="360"/>
+      </w:pPr>
+      <w:rPr>
+        <w:rFonts w:ascii="Courier New" w:hAnsi="Courier New" w:cs="Courier New" w:hint="default"/>
+      </w:rPr>
+    </w:lvl>
+    <w:lvl w:ilvl="2" w:tplc="04190005" w:tentative="1">
+      <w:start w:val="1"/>
+      <w:numFmt w:val="bullet"/>
+      <w:lvlText w:val=""/>
+      <w:lvlJc w:val="left"/>
+      <w:pPr>
+        <w:ind w:left="2869" w:hanging="360"/>
+      </w:pPr>
+      <w:rPr>
+        <w:rFonts w:ascii="Wingdings" w:hAnsi="Wingdings" w:hint="default"/>
+      </w:rPr>
+    </w:lvl>
+    <w:lvl w:ilvl="3" w:tplc="04190001" w:tentative="1">
+      <w:start w:val="1"/>
+      <w:numFmt w:val="bullet"/>
+      <w:lvlText w:val=""/>
+      <w:lvlJc w:val="left"/>
+      <w:pPr>
+        <w:ind w:left="3589" w:hanging="360"/>
+      </w:pPr>
+      <w:rPr>
+        <w:rFonts w:ascii="Symbol" w:hAnsi="Symbol" w:hint="default"/>
+      </w:rPr>
+    </w:lvl>
+    <w:lvl w:ilvl="4" w:tplc="04190003" w:tentative="1">
+      <w:start w:val="1"/>
+      <w:numFmt w:val="bullet"/>
+      <w:lvlText w:val="o"/>
+      <w:lvlJc w:val="left"/>
+      <w:pPr>
+        <w:ind w:left="4309" w:hanging="360"/>
+      </w:pPr>
+      <w:rPr>
+        <w:rFonts w:ascii="Courier New" w:hAnsi="Courier New" w:cs="Courier New" w:hint="default"/>
+      </w:rPr>
+    </w:lvl>
+    <w:lvl w:ilvl="5" w:tplc="04190005" w:tentative="1">
+      <w:start w:val="1"/>
+      <w:numFmt w:val="bullet"/>
+      <w:lvlText w:val=""/>
+      <w:lvlJc w:val="left"/>
+      <w:pPr>
+        <w:ind w:left="5029" w:hanging="360"/>
+      </w:pPr>
+      <w:rPr>
+        <w:rFonts w:ascii="Wingdings" w:hAnsi="Wingdings" w:hint="default"/>
+      </w:rPr>
+    </w:lvl>
+    <w:lvl w:ilvl="6" w:tplc="04190001" w:tentative="1">
+      <w:start w:val="1"/>
+      <w:numFmt w:val="bullet"/>
+      <w:lvlText w:val=""/>
+      <w:lvlJc w:val="left"/>
+      <w:pPr>
+        <w:ind w:left="5749" w:hanging="360"/>
+      </w:pPr>
+      <w:rPr>
+        <w:rFonts w:ascii="Symbol" w:hAnsi="Symbol" w:hint="default"/>
+      </w:rPr>
+    </w:lvl>
+    <w:lvl w:ilvl="7" w:tplc="04190003" w:tentative="1">
+      <w:start w:val="1"/>
+      <w:numFmt w:val="bullet"/>
+      <w:lvlText w:val="o"/>
+      <w:lvlJc w:val="left"/>
+      <w:pPr>
+        <w:ind w:left="6469" w:hanging="360"/>
+      </w:pPr>
+      <w:rPr>
+        <w:rFonts w:ascii="Courier New" w:hAnsi="Courier New" w:cs="Courier New" w:hint="default"/>
+      </w:rPr>
+    </w:lvl>
+    <w:lvl w:ilvl="8" w:tplc="04190005" w:tentative="1">
+      <w:start w:val="1"/>
+      <w:numFmt w:val="bullet"/>
+      <w:lvlText w:val=""/>
+      <w:lvlJc w:val="left"/>
+      <w:pPr>
+        <w:ind w:left="7189" w:hanging="360"/>
+      </w:pPr>
+      <w:rPr>
+        <w:rFonts w:ascii="Wingdings" w:hAnsi="Wingdings" w:hint="default"/>
+      </w:rPr>
+    </w:lvl>
+  </w:abstractNum>
+  <w:abstractNum w:abstractNumId="12" w15:restartNumberingAfterBreak="0">
     <w:nsid w:val="1C650974"/>
     <w:multiLevelType w:val="hybridMultilevel"/>
     <w:tmpl w:val="D4126E4E"/>
@@ -3052,7 +4237,7 @@
       </w:rPr>
     </w:lvl>
   </w:abstractNum>
-  <w:abstractNum w:abstractNumId="12" w15:restartNumberingAfterBreak="0">
+  <w:abstractNum w:abstractNumId="13" w15:restartNumberingAfterBreak="0">
     <w:nsid w:val="240A3EF7"/>
     <w:multiLevelType w:val="multilevel"/>
     <w:tmpl w:val="89482F56"/>
@@ -3173,7 +4358,7 @@
       </w:rPr>
     </w:lvl>
   </w:abstractNum>
-  <w:abstractNum w:abstractNumId="13" w15:restartNumberingAfterBreak="0">
+  <w:abstractNum w:abstractNumId="14" w15:restartNumberingAfterBreak="0">
     <w:nsid w:val="26E022B8"/>
     <w:multiLevelType w:val="hybridMultilevel"/>
     <w:tmpl w:val="3EBE71B8"/>
@@ -3286,7 +4471,7 @@
       </w:rPr>
     </w:lvl>
   </w:abstractNum>
-  <w:abstractNum w:abstractNumId="14" w15:restartNumberingAfterBreak="0">
+  <w:abstractNum w:abstractNumId="15" w15:restartNumberingAfterBreak="0">
     <w:nsid w:val="2C6E26BB"/>
     <w:multiLevelType w:val="hybridMultilevel"/>
     <w:tmpl w:val="18607696"/>
@@ -3399,7 +4584,7 @@
       </w:rPr>
     </w:lvl>
   </w:abstractNum>
-  <w:abstractNum w:abstractNumId="15" w15:restartNumberingAfterBreak="0">
+  <w:abstractNum w:abstractNumId="16" w15:restartNumberingAfterBreak="0">
     <w:nsid w:val="2DFF3A99"/>
     <w:multiLevelType w:val="hybridMultilevel"/>
     <w:tmpl w:val="61FA53A4"/>
@@ -3512,7 +4697,7 @@
       </w:rPr>
     </w:lvl>
   </w:abstractNum>
-  <w:abstractNum w:abstractNumId="16" w15:restartNumberingAfterBreak="0">
+  <w:abstractNum w:abstractNumId="17" w15:restartNumberingAfterBreak="0">
     <w:nsid w:val="2EB51AE6"/>
     <w:multiLevelType w:val="hybridMultilevel"/>
     <w:tmpl w:val="1DB86AF4"/>
@@ -3602,7 +4787,7 @@
       </w:pPr>
     </w:lvl>
   </w:abstractNum>
-  <w:abstractNum w:abstractNumId="17" w15:restartNumberingAfterBreak="0">
+  <w:abstractNum w:abstractNumId="18" w15:restartNumberingAfterBreak="0">
     <w:nsid w:val="31386359"/>
     <w:multiLevelType w:val="hybridMultilevel"/>
     <w:tmpl w:val="2646D720"/>
@@ -3715,7 +4900,7 @@
       </w:rPr>
     </w:lvl>
   </w:abstractNum>
-  <w:abstractNum w:abstractNumId="18" w15:restartNumberingAfterBreak="0">
+  <w:abstractNum w:abstractNumId="19" w15:restartNumberingAfterBreak="0">
     <w:nsid w:val="313D20CE"/>
     <w:multiLevelType w:val="hybridMultilevel"/>
     <w:tmpl w:val="6B7A86A6"/>
@@ -3828,7 +5013,7 @@
       </w:rPr>
     </w:lvl>
   </w:abstractNum>
-  <w:abstractNum w:abstractNumId="19" w15:restartNumberingAfterBreak="0">
+  <w:abstractNum w:abstractNumId="20" w15:restartNumberingAfterBreak="0">
     <w:nsid w:val="3B4C19D6"/>
     <w:multiLevelType w:val="hybridMultilevel"/>
     <w:tmpl w:val="B4BE712C"/>
@@ -3914,7 +5099,7 @@
       </w:pPr>
     </w:lvl>
   </w:abstractNum>
-  <w:abstractNum w:abstractNumId="20" w15:restartNumberingAfterBreak="0">
+  <w:abstractNum w:abstractNumId="21" w15:restartNumberingAfterBreak="0">
     <w:nsid w:val="3CA30537"/>
     <w:multiLevelType w:val="multilevel"/>
     <w:tmpl w:val="89482F56"/>
@@ -4035,7 +5220,7 @@
       </w:rPr>
     </w:lvl>
   </w:abstractNum>
-  <w:abstractNum w:abstractNumId="21" w15:restartNumberingAfterBreak="0">
+  <w:abstractNum w:abstractNumId="22" w15:restartNumberingAfterBreak="0">
     <w:nsid w:val="40D865E4"/>
     <w:multiLevelType w:val="hybridMultilevel"/>
     <w:tmpl w:val="75D87CCE"/>
@@ -4124,7 +5309,7 @@
       </w:pPr>
     </w:lvl>
   </w:abstractNum>
-  <w:abstractNum w:abstractNumId="22" w15:restartNumberingAfterBreak="0">
+  <w:abstractNum w:abstractNumId="23" w15:restartNumberingAfterBreak="0">
     <w:nsid w:val="424469DC"/>
     <w:multiLevelType w:val="hybridMultilevel"/>
     <w:tmpl w:val="D7B4996E"/>
@@ -4237,7 +5422,7 @@
       </w:rPr>
     </w:lvl>
   </w:abstractNum>
-  <w:abstractNum w:abstractNumId="23" w15:restartNumberingAfterBreak="0">
+  <w:abstractNum w:abstractNumId="24" w15:restartNumberingAfterBreak="0">
     <w:nsid w:val="42DA76D4"/>
     <w:multiLevelType w:val="hybridMultilevel"/>
     <w:tmpl w:val="FDDA62BE"/>
@@ -4350,7 +5535,7 @@
       </w:rPr>
     </w:lvl>
   </w:abstractNum>
-  <w:abstractNum w:abstractNumId="24" w15:restartNumberingAfterBreak="0">
+  <w:abstractNum w:abstractNumId="25" w15:restartNumberingAfterBreak="0">
     <w:nsid w:val="430F6AC1"/>
     <w:multiLevelType w:val="hybridMultilevel"/>
     <w:tmpl w:val="61DA50F8"/>
@@ -4439,7 +5624,7 @@
       </w:pPr>
     </w:lvl>
   </w:abstractNum>
-  <w:abstractNum w:abstractNumId="25" w15:restartNumberingAfterBreak="0">
+  <w:abstractNum w:abstractNumId="26" w15:restartNumberingAfterBreak="0">
     <w:nsid w:val="46090CE8"/>
     <w:multiLevelType w:val="hybridMultilevel"/>
     <w:tmpl w:val="AEC4389C"/>
@@ -4552,7 +5737,7 @@
       </w:rPr>
     </w:lvl>
   </w:abstractNum>
-  <w:abstractNum w:abstractNumId="26" w15:restartNumberingAfterBreak="0">
+  <w:abstractNum w:abstractNumId="27" w15:restartNumberingAfterBreak="0">
     <w:nsid w:val="4A3934BD"/>
     <w:multiLevelType w:val="hybridMultilevel"/>
     <w:tmpl w:val="EAD6D390"/>
@@ -4638,7 +5823,7 @@
       </w:pPr>
     </w:lvl>
   </w:abstractNum>
-  <w:abstractNum w:abstractNumId="27" w15:restartNumberingAfterBreak="0">
+  <w:abstractNum w:abstractNumId="28" w15:restartNumberingAfterBreak="0">
     <w:nsid w:val="4E5C5BF6"/>
     <w:multiLevelType w:val="hybridMultilevel"/>
     <w:tmpl w:val="46CA2E3E"/>
@@ -4727,7 +5912,7 @@
       </w:pPr>
     </w:lvl>
   </w:abstractNum>
-  <w:abstractNum w:abstractNumId="28" w15:restartNumberingAfterBreak="0">
+  <w:abstractNum w:abstractNumId="29" w15:restartNumberingAfterBreak="0">
     <w:nsid w:val="4F4E264F"/>
     <w:multiLevelType w:val="multilevel"/>
     <w:tmpl w:val="8458CDE4"/>
@@ -4857,7 +6042,7 @@
       </w:rPr>
     </w:lvl>
   </w:abstractNum>
-  <w:abstractNum w:abstractNumId="29" w15:restartNumberingAfterBreak="0">
+  <w:abstractNum w:abstractNumId="30" w15:restartNumberingAfterBreak="0">
     <w:nsid w:val="51F27C7D"/>
     <w:multiLevelType w:val="hybridMultilevel"/>
     <w:tmpl w:val="581A55C2"/>
@@ -4946,7 +6131,7 @@
       </w:pPr>
     </w:lvl>
   </w:abstractNum>
-  <w:abstractNum w:abstractNumId="30" w15:restartNumberingAfterBreak="0">
+  <w:abstractNum w:abstractNumId="31" w15:restartNumberingAfterBreak="0">
     <w:nsid w:val="52390DE1"/>
     <w:multiLevelType w:val="hybridMultilevel"/>
     <w:tmpl w:val="432090FA"/>
@@ -5032,7 +6217,7 @@
       </w:pPr>
     </w:lvl>
   </w:abstractNum>
-  <w:abstractNum w:abstractNumId="31" w15:restartNumberingAfterBreak="0">
+  <w:abstractNum w:abstractNumId="32" w15:restartNumberingAfterBreak="0">
     <w:nsid w:val="56E25863"/>
     <w:multiLevelType w:val="hybridMultilevel"/>
     <w:tmpl w:val="D72C4F50"/>
@@ -5123,7 +6308,120 @@
       </w:pPr>
     </w:lvl>
   </w:abstractNum>
-  <w:abstractNum w:abstractNumId="32" w15:restartNumberingAfterBreak="0">
+  <w:abstractNum w:abstractNumId="33" w15:restartNumberingAfterBreak="0">
+    <w:nsid w:val="595E3ED1"/>
+    <w:multiLevelType w:val="hybridMultilevel"/>
+    <w:tmpl w:val="0E5A0C26"/>
+    <w:lvl w:ilvl="0" w:tplc="04190001">
+      <w:start w:val="1"/>
+      <w:numFmt w:val="bullet"/>
+      <w:lvlText w:val=""/>
+      <w:lvlJc w:val="left"/>
+      <w:pPr>
+        <w:ind w:left="1429" w:hanging="360"/>
+      </w:pPr>
+      <w:rPr>
+        <w:rFonts w:ascii="Symbol" w:hAnsi="Symbol" w:hint="default"/>
+      </w:rPr>
+    </w:lvl>
+    <w:lvl w:ilvl="1" w:tplc="04190003" w:tentative="1">
+      <w:start w:val="1"/>
+      <w:numFmt w:val="bullet"/>
+      <w:lvlText w:val="o"/>
+      <w:lvlJc w:val="left"/>
+      <w:pPr>
+        <w:ind w:left="2149" w:hanging="360"/>
+      </w:pPr>
+      <w:rPr>
+        <w:rFonts w:ascii="Courier New" w:hAnsi="Courier New" w:cs="Courier New" w:hint="default"/>
+      </w:rPr>
+    </w:lvl>
+    <w:lvl w:ilvl="2" w:tplc="04190005" w:tentative="1">
+      <w:start w:val="1"/>
+      <w:numFmt w:val="bullet"/>
+      <w:lvlText w:val=""/>
+      <w:lvlJc w:val="left"/>
+      <w:pPr>
+        <w:ind w:left="2869" w:hanging="360"/>
+      </w:pPr>
+      <w:rPr>
+        <w:rFonts w:ascii="Wingdings" w:hAnsi="Wingdings" w:hint="default"/>
+      </w:rPr>
+    </w:lvl>
+    <w:lvl w:ilvl="3" w:tplc="04190001" w:tentative="1">
+      <w:start w:val="1"/>
+      <w:numFmt w:val="bullet"/>
+      <w:lvlText w:val=""/>
+      <w:lvlJc w:val="left"/>
+      <w:pPr>
+        <w:ind w:left="3589" w:hanging="360"/>
+      </w:pPr>
+      <w:rPr>
+        <w:rFonts w:ascii="Symbol" w:hAnsi="Symbol" w:hint="default"/>
+      </w:rPr>
+    </w:lvl>
+    <w:lvl w:ilvl="4" w:tplc="04190003" w:tentative="1">
+      <w:start w:val="1"/>
+      <w:numFmt w:val="bullet"/>
+      <w:lvlText w:val="o"/>
+      <w:lvlJc w:val="left"/>
+      <w:pPr>
+        <w:ind w:left="4309" w:hanging="360"/>
+      </w:pPr>
+      <w:rPr>
+        <w:rFonts w:ascii="Courier New" w:hAnsi="Courier New" w:cs="Courier New" w:hint="default"/>
+      </w:rPr>
+    </w:lvl>
+    <w:lvl w:ilvl="5" w:tplc="04190005" w:tentative="1">
+      <w:start w:val="1"/>
+      <w:numFmt w:val="bullet"/>
+      <w:lvlText w:val=""/>
+      <w:lvlJc w:val="left"/>
+      <w:pPr>
+        <w:ind w:left="5029" w:hanging="360"/>
+      </w:pPr>
+      <w:rPr>
+        <w:rFonts w:ascii="Wingdings" w:hAnsi="Wingdings" w:hint="default"/>
+      </w:rPr>
+    </w:lvl>
+    <w:lvl w:ilvl="6" w:tplc="04190001" w:tentative="1">
+      <w:start w:val="1"/>
+      <w:numFmt w:val="bullet"/>
+      <w:lvlText w:val=""/>
+      <w:lvlJc w:val="left"/>
+      <w:pPr>
+        <w:ind w:left="5749" w:hanging="360"/>
+      </w:pPr>
+      <w:rPr>
+        <w:rFonts w:ascii="Symbol" w:hAnsi="Symbol" w:hint="default"/>
+      </w:rPr>
+    </w:lvl>
+    <w:lvl w:ilvl="7" w:tplc="04190003" w:tentative="1">
+      <w:start w:val="1"/>
+      <w:numFmt w:val="bullet"/>
+      <w:lvlText w:val="o"/>
+      <w:lvlJc w:val="left"/>
+      <w:pPr>
+        <w:ind w:left="6469" w:hanging="360"/>
+      </w:pPr>
+      <w:rPr>
+        <w:rFonts w:ascii="Courier New" w:hAnsi="Courier New" w:cs="Courier New" w:hint="default"/>
+      </w:rPr>
+    </w:lvl>
+    <w:lvl w:ilvl="8" w:tplc="04190005" w:tentative="1">
+      <w:start w:val="1"/>
+      <w:numFmt w:val="bullet"/>
+      <w:lvlText w:val=""/>
+      <w:lvlJc w:val="left"/>
+      <w:pPr>
+        <w:ind w:left="7189" w:hanging="360"/>
+      </w:pPr>
+      <w:rPr>
+        <w:rFonts w:ascii="Wingdings" w:hAnsi="Wingdings" w:hint="default"/>
+      </w:rPr>
+    </w:lvl>
+  </w:abstractNum>
+  <w:abstractNum w:abstractNumId="34" w15:restartNumberingAfterBreak="0">
     <w:nsid w:val="59833B18"/>
     <w:multiLevelType w:val="hybridMultilevel"/>
     <w:tmpl w:val="F47AB5AC"/>
@@ -5212,7 +6510,7 @@
       </w:pPr>
     </w:lvl>
   </w:abstractNum>
-  <w:abstractNum w:abstractNumId="33" w15:restartNumberingAfterBreak="0">
+  <w:abstractNum w:abstractNumId="35" w15:restartNumberingAfterBreak="0">
     <w:nsid w:val="5A2F11B7"/>
     <w:multiLevelType w:val="hybridMultilevel"/>
     <w:tmpl w:val="A72A820A"/>
@@ -5325,7 +6623,7 @@
       </w:rPr>
     </w:lvl>
   </w:abstractNum>
-  <w:abstractNum w:abstractNumId="34" w15:restartNumberingAfterBreak="0">
+  <w:abstractNum w:abstractNumId="36" w15:restartNumberingAfterBreak="0">
     <w:nsid w:val="5C8A5229"/>
     <w:multiLevelType w:val="multilevel"/>
     <w:tmpl w:val="E1E810D4"/>
@@ -5450,7 +6748,7 @@
       </w:rPr>
     </w:lvl>
   </w:abstractNum>
-  <w:abstractNum w:abstractNumId="35" w15:restartNumberingAfterBreak="0">
+  <w:abstractNum w:abstractNumId="37" w15:restartNumberingAfterBreak="0">
     <w:nsid w:val="609C7DEC"/>
     <w:multiLevelType w:val="hybridMultilevel"/>
     <w:tmpl w:val="4C301C84"/>
@@ -5544,7 +6842,7 @@
       </w:pPr>
     </w:lvl>
   </w:abstractNum>
-  <w:abstractNum w:abstractNumId="36" w15:restartNumberingAfterBreak="0">
+  <w:abstractNum w:abstractNumId="38" w15:restartNumberingAfterBreak="0">
     <w:nsid w:val="636E398C"/>
     <w:multiLevelType w:val="hybridMultilevel"/>
     <w:tmpl w:val="F7BEBBFE"/>
@@ -5657,7 +6955,7 @@
       </w:rPr>
     </w:lvl>
   </w:abstractNum>
-  <w:abstractNum w:abstractNumId="37" w15:restartNumberingAfterBreak="0">
+  <w:abstractNum w:abstractNumId="39" w15:restartNumberingAfterBreak="0">
     <w:nsid w:val="65861803"/>
     <w:multiLevelType w:val="hybridMultilevel"/>
     <w:tmpl w:val="DC02BE1E"/>
@@ -5770,7 +7068,7 @@
       </w:rPr>
     </w:lvl>
   </w:abstractNum>
-  <w:abstractNum w:abstractNumId="38" w15:restartNumberingAfterBreak="0">
+  <w:abstractNum w:abstractNumId="40" w15:restartNumberingAfterBreak="0">
     <w:nsid w:val="6C831BD4"/>
     <w:multiLevelType w:val="hybridMultilevel"/>
     <w:tmpl w:val="A56C8F62"/>
@@ -5859,7 +7157,7 @@
       </w:pPr>
     </w:lvl>
   </w:abstractNum>
-  <w:abstractNum w:abstractNumId="39" w15:restartNumberingAfterBreak="0">
+  <w:abstractNum w:abstractNumId="41" w15:restartNumberingAfterBreak="0">
     <w:nsid w:val="72864530"/>
     <w:multiLevelType w:val="hybridMultilevel"/>
     <w:tmpl w:val="01FA3580"/>
@@ -5979,19 +7277,19 @@
     <w:abstractNumId w:val="10"/>
   </w:num>
   <w:num w:numId="3">
-    <w:abstractNumId w:val="16"/>
+    <w:abstractNumId w:val="17"/>
   </w:num>
   <w:num w:numId="4">
-    <w:abstractNumId w:val="34"/>
+    <w:abstractNumId w:val="36"/>
   </w:num>
   <w:num w:numId="5">
-    <w:abstractNumId w:val="28"/>
+    <w:abstractNumId w:val="29"/>
   </w:num>
   <w:num w:numId="6">
     <w:abstractNumId w:val="6"/>
   </w:num>
   <w:num w:numId="7">
-    <w:abstractNumId w:val="31"/>
+    <w:abstractNumId w:val="32"/>
   </w:num>
   <w:num w:numId="8">
     <w:abstractNumId w:val="4"/>
@@ -6000,13 +7298,13 @@
     <w:abstractNumId w:val="8"/>
   </w:num>
   <w:num w:numId="10">
-    <w:abstractNumId w:val="12"/>
+    <w:abstractNumId w:val="13"/>
   </w:num>
   <w:num w:numId="11">
-    <w:abstractNumId w:val="20"/>
+    <w:abstractNumId w:val="21"/>
   </w:num>
   <w:num w:numId="12">
-    <w:abstractNumId w:val="29"/>
+    <w:abstractNumId w:val="30"/>
   </w:num>
   <w:num w:numId="13">
     <w:abstractNumId w:val="9"/>
@@ -6015,43 +7313,43 @@
     <w:abstractNumId w:val="0"/>
   </w:num>
   <w:num w:numId="15">
-    <w:abstractNumId w:val="38"/>
+    <w:abstractNumId w:val="40"/>
   </w:num>
   <w:num w:numId="16">
-    <w:abstractNumId w:val="32"/>
+    <w:abstractNumId w:val="34"/>
   </w:num>
   <w:num w:numId="17">
-    <w:abstractNumId w:val="14"/>
+    <w:abstractNumId w:val="15"/>
   </w:num>
   <w:num w:numId="18">
+    <w:abstractNumId w:val="23"/>
+  </w:num>
+  <w:num w:numId="19">
+    <w:abstractNumId w:val="31"/>
+  </w:num>
+  <w:num w:numId="20">
+    <w:abstractNumId w:val="25"/>
+  </w:num>
+  <w:num w:numId="21">
     <w:abstractNumId w:val="22"/>
   </w:num>
-  <w:num w:numId="19">
-    <w:abstractNumId w:val="30"/>
-  </w:num>
-  <w:num w:numId="20">
-    <w:abstractNumId w:val="24"/>
-  </w:num>
-  <w:num w:numId="21">
-    <w:abstractNumId w:val="21"/>
-  </w:num>
   <w:num w:numId="22">
-    <w:abstractNumId w:val="35"/>
+    <w:abstractNumId w:val="37"/>
   </w:num>
   <w:num w:numId="23">
-    <w:abstractNumId w:val="27"/>
+    <w:abstractNumId w:val="28"/>
   </w:num>
   <w:num w:numId="24">
-    <w:abstractNumId w:val="18"/>
+    <w:abstractNumId w:val="19"/>
   </w:num>
   <w:num w:numId="25">
-    <w:abstractNumId w:val="15"/>
+    <w:abstractNumId w:val="16"/>
   </w:num>
   <w:num w:numId="26">
-    <w:abstractNumId w:val="25"/>
+    <w:abstractNumId w:val="26"/>
   </w:num>
   <w:num w:numId="27">
-    <w:abstractNumId w:val="11"/>
+    <w:abstractNumId w:val="12"/>
   </w:num>
   <w:num w:numId="28">
     <w:abstractNumId w:val="2"/>
@@ -6060,37 +7358,43 @@
     <w:abstractNumId w:val="3"/>
   </w:num>
   <w:num w:numId="30">
-    <w:abstractNumId w:val="37"/>
+    <w:abstractNumId w:val="39"/>
   </w:num>
   <w:num w:numId="31">
-    <w:abstractNumId w:val="26"/>
+    <w:abstractNumId w:val="27"/>
   </w:num>
   <w:num w:numId="32">
-    <w:abstractNumId w:val="39"/>
+    <w:abstractNumId w:val="41"/>
   </w:num>
   <w:num w:numId="33">
     <w:abstractNumId w:val="5"/>
   </w:num>
   <w:num w:numId="34">
-    <w:abstractNumId w:val="36"/>
+    <w:abstractNumId w:val="38"/>
   </w:num>
   <w:num w:numId="35">
-    <w:abstractNumId w:val="33"/>
+    <w:abstractNumId w:val="35"/>
   </w:num>
   <w:num w:numId="36">
-    <w:abstractNumId w:val="13"/>
+    <w:abstractNumId w:val="14"/>
   </w:num>
   <w:num w:numId="37">
-    <w:abstractNumId w:val="17"/>
+    <w:abstractNumId w:val="18"/>
   </w:num>
   <w:num w:numId="38">
-    <w:abstractNumId w:val="23"/>
+    <w:abstractNumId w:val="24"/>
   </w:num>
   <w:num w:numId="39">
-    <w:abstractNumId w:val="19"/>
+    <w:abstractNumId w:val="20"/>
   </w:num>
   <w:num w:numId="40">
     <w:abstractNumId w:val="1"/>
+  </w:num>
+  <w:num w:numId="41">
+    <w:abstractNumId w:val="11"/>
+  </w:num>
+  <w:num w:numId="42">
+    <w:abstractNumId w:val="33"/>
   </w:num>
   <w:numIdMacAtCleanup w:val="12"/>
 </w:numbering>
@@ -6585,6 +7889,7 @@
   <w:style w:type="character" w:default="1" w:styleId="a8">
     <w:name w:val="Default Paragraph Font"/>
     <w:uiPriority w:val="1"/>
+    <w:semiHidden/>
     <w:unhideWhenUsed/>
   </w:style>
   <w:style w:type="table" w:default="1" w:styleId="a9">

</xml_diff>

<commit_message>
Images and start 2nd part
</commit_message>
<xml_diff>
--- a/Docs/Основное/РПЗ Диплом ШаруновРД.docx
+++ b/Docs/Основное/РПЗ Диплом ШаруновРД.docx
@@ -532,6 +532,9 @@
         <w:t>1</w:t>
       </w:r>
       <w:r>
+        <w:rPr>
+          <w:noProof/>
+        </w:rPr>
         <w:fldChar w:fldCharType="end"/>
       </w:r>
       <w:r>
@@ -691,6 +694,9 @@
         <w:t>2</w:t>
       </w:r>
       <w:r>
+        <w:rPr>
+          <w:noProof/>
+        </w:rPr>
         <w:fldChar w:fldCharType="end"/>
       </w:r>
       <w:r>
@@ -981,6 +987,9 @@
         <w:t>3</w:t>
       </w:r>
       <w:r>
+        <w:rPr>
+          <w:noProof/>
+        </w:rPr>
         <w:fldChar w:fldCharType="end"/>
       </w:r>
       <w:r>
@@ -1295,6 +1304,9 @@
         <w:t>4</w:t>
       </w:r>
       <w:r>
+        <w:rPr>
+          <w:noProof/>
+        </w:rPr>
         <w:fldChar w:fldCharType="end"/>
       </w:r>
       <w:r>
@@ -2501,23 +2513,7 @@
           <w:color w:val="FF0000"/>
           <w:lang w:val="en-US"/>
         </w:rPr>
-        <w:t xml:space="preserve">$2&lt;a/b/x/y&gt;$[cost]$(22 character </w:t>
-      </w:r>
-      <w:proofErr w:type="gramStart"/>
-      <w:r>
-        <w:rPr>
-          <w:color w:val="FF0000"/>
-          <w:lang w:val="en-US"/>
-        </w:rPr>
-        <w:t>salt)(</w:t>
-      </w:r>
-      <w:proofErr w:type="gramEnd"/>
-      <w:r>
-        <w:rPr>
-          <w:color w:val="FF0000"/>
-          <w:lang w:val="en-US"/>
-        </w:rPr>
-        <w:t>31 character hash)</w:t>
+        <w:t>$2&lt;a/b/x/y&gt;$[cost]$(22 character salt)(31 character hash)</w:t>
       </w:r>
     </w:p>
     <w:p>
@@ -2844,21 +2840,7 @@
         <w:rPr>
           <w:color w:val="FF0000"/>
         </w:rPr>
-        <w:t xml:space="preserve"> использует таблицу </w:t>
-      </w:r>
-      <w:proofErr w:type="gramStart"/>
-      <w:r>
-        <w:rPr>
-          <w:color w:val="FF0000"/>
-        </w:rPr>
-        <w:t>«./</w:t>
-      </w:r>
-      <w:proofErr w:type="gramEnd"/>
-      <w:r>
-        <w:rPr>
-          <w:color w:val="FF0000"/>
-        </w:rPr>
-        <w:t>ABCDEFGHIJKLMNOPQRSTUVWXYZabcdefghijklmnopqrstuvwxyz0123456789», которая отличается от кодировки Base64 в RFC 4648. []</w:t>
+        <w:t xml:space="preserve"> использует таблицу «./ABCDEFGHIJKLMNOPQRSTUVWXYZabcdefghijklmnopqrstuvwxyz0123456789», которая отличается от кодировки Base64 в RFC 4648. []</w:t>
       </w:r>
     </w:p>
     <w:p>
@@ -3407,13 +3389,7 @@
         <w:spacing w:before="240"/>
       </w:pPr>
       <w:r>
-        <w:t>4</w:t>
-      </w:r>
-      <w:r>
-        <w:t xml:space="preserve">. Инструменты </w:t>
-      </w:r>
-      <w:r>
-        <w:t>модуля интеллектуальной обработки.</w:t>
+        <w:t>4. Инструменты модуля интеллектуальной обработки.</w:t>
       </w:r>
     </w:p>
     <w:p>
@@ -3932,10 +3908,7 @@
         </w:numPr>
       </w:pPr>
       <w:r>
-        <w:t>Выполнять поиск наиболее похожих векторов непосредственно средствами SQL-запросов с использованием специализированных индексов</w:t>
-      </w:r>
-      <w:r>
-        <w:t>.</w:t>
+        <w:t>Выполнять поиск наиболее похожих векторов непосредственно средствами SQL-запросов с использованием специализированных индексов.</w:t>
       </w:r>
     </w:p>
     <w:p>
@@ -3947,10 +3920,7 @@
         </w:numPr>
       </w:pPr>
       <w:r>
-        <w:t>Отстранить</w:t>
-      </w:r>
-      <w:r>
-        <w:t xml:space="preserve"> необходимость в развертывании отдельных векторных баз данных, что снижает требования к инфраструктуре и упрощает администрирование системы.</w:t>
+        <w:t>Отстранить необходимость в развертывании отдельных векторных баз данных, что снижает требования к инфраструктуре и упрощает администрирование системы.</w:t>
       </w:r>
     </w:p>
     <w:p>
@@ -4200,10 +4170,7 @@
         <w:pStyle w:val="ab"/>
       </w:pPr>
       <w:r>
-        <w:t xml:space="preserve">Полное наименование работы: </w:t>
-      </w:r>
-      <w:r>
-        <w:t>Сервис для организации праздничных пожеланий</w:t>
+        <w:t>Полное наименование работы: Сервис для организации праздничных пожеланий</w:t>
       </w:r>
     </w:p>
     <w:p>
@@ -4406,13 +4373,7 @@
         <w:pStyle w:val="ab"/>
       </w:pPr>
       <w:r>
-        <w:t>База знаний подарков: централизованное хранилище структурированных данных о возможных вариантах подарков</w:t>
-      </w:r>
-      <w:r>
-        <w:t>,</w:t>
-      </w:r>
-      <w:r>
-        <w:t xml:space="preserve"> используемое для обучения рекомендательных алгоритмов и обеспечения работы глобального поиска.</w:t>
+        <w:t>База знаний подарков: централизованное хранилище структурированных данных о возможных вариантах подарков, используемое для обучения рекомендательных алгоритмов и обеспечения работы глобального поиска.</w:t>
       </w:r>
     </w:p>
     <w:p>
@@ -5625,18 +5586,820 @@
     </w:p>
     <w:p>
       <w:pPr>
-        <w:pStyle w:val="ab"/>
-      </w:pPr>
-    </w:p>
-    <w:p>
-      <w:pPr>
-        <w:pStyle w:val="ab"/>
+        <w:rPr>
+          <w:rFonts w:ascii="Times New Roman" w:hAnsi="Times New Roman"/>
+          <w:sz w:val="28"/>
+        </w:rPr>
+      </w:pPr>
+      <w:r>
+        <w:br w:type="page"/>
+      </w:r>
+    </w:p>
+    <w:p>
+      <w:pPr>
+        <w:pStyle w:val="a2"/>
+      </w:pPr>
+      <w:bookmarkStart w:id="145" w:name="_Toc167839056"/>
+      <w:r>
+        <w:lastRenderedPageBreak/>
+        <w:t>ПРОЕКТНО-КОНСТРУКТОРСКАЯ ЧАСТЬ</w:t>
+      </w:r>
+      <w:bookmarkEnd w:id="145"/>
+    </w:p>
+    <w:p>
+      <w:pPr>
+        <w:pStyle w:val="a3"/>
+        <w:spacing w:before="240"/>
+      </w:pPr>
+      <w:bookmarkStart w:id="146" w:name="_Toc167839057"/>
+      <w:r>
+        <w:t>Разработка структуры приложения</w:t>
+      </w:r>
+      <w:bookmarkEnd w:id="146"/>
+    </w:p>
+    <w:p>
+      <w:pPr>
+        <w:pStyle w:val="ab"/>
+      </w:pPr>
+      <w:r>
+        <w:t>Далее</w:t>
+      </w:r>
+      <w:r>
+        <w:t xml:space="preserve"> представлена структурная схема архитектуры системы</w:t>
+      </w:r>
+      <w:r>
+        <w:t xml:space="preserve"> (</w:t>
+      </w:r>
+      <w:r>
+        <w:fldChar w:fldCharType="begin"/>
+      </w:r>
+      <w:r>
+        <w:instrText xml:space="preserve"> REF _Ref229955465 \h </w:instrText>
+      </w:r>
+      <w:r>
+        <w:fldChar w:fldCharType="separate"/>
+      </w:r>
+      <w:r>
+        <w:t xml:space="preserve">Рис. </w:t>
+      </w:r>
+      <w:r>
+        <w:rPr>
+          <w:noProof/>
+        </w:rPr>
+        <w:t>7</w:t>
+      </w:r>
+      <w:r>
+        <w:fldChar w:fldCharType="end"/>
+      </w:r>
+      <w:r>
+        <w:t>)</w:t>
+      </w:r>
+      <w:r>
+        <w:t>.</w:t>
+      </w:r>
+    </w:p>
+    <w:p>
+      <w:pPr>
+        <w:pStyle w:val="ab"/>
+        <w:keepNext/>
         <w:ind w:firstLine="0"/>
         <w:jc w:val="center"/>
       </w:pPr>
+      <w:r>
+        <w:rPr>
+          <w:noProof/>
+        </w:rPr>
+        <w:drawing>
+          <wp:inline distT="0" distB="0" distL="0" distR="0" wp14:anchorId="3C30706D" wp14:editId="5085234D">
+            <wp:extent cx="2738654" cy="2980267"/>
+            <wp:effectExtent l="0" t="0" r="5080" b="0"/>
+            <wp:docPr id="8" name="Рисунок 8"/>
+            <wp:cNvGraphicFramePr>
+              <a:graphicFrameLocks xmlns:a="http://schemas.openxmlformats.org/drawingml/2006/main" noChangeAspect="1"/>
+            </wp:cNvGraphicFramePr>
+            <a:graphic xmlns:a="http://schemas.openxmlformats.org/drawingml/2006/main">
+              <a:graphicData uri="http://schemas.openxmlformats.org/drawingml/2006/picture">
+                <pic:pic xmlns:pic="http://schemas.openxmlformats.org/drawingml/2006/picture">
+                  <pic:nvPicPr>
+                    <pic:cNvPr id="0" name="Picture 1"/>
+                    <pic:cNvPicPr>
+                      <a:picLocks noChangeAspect="1" noChangeArrowheads="1"/>
+                    </pic:cNvPicPr>
+                  </pic:nvPicPr>
+                  <pic:blipFill>
+                    <a:blip r:embed="rId15">
+                      <a:extLst>
+                        <a:ext uri="{28A0092B-C50C-407E-A947-70E740481C1C}">
+                          <a14:useLocalDpi xmlns:a14="http://schemas.microsoft.com/office/drawing/2010/main" val="0"/>
+                        </a:ext>
+                      </a:extLst>
+                    </a:blip>
+                    <a:srcRect/>
+                    <a:stretch>
+                      <a:fillRect/>
+                    </a:stretch>
+                  </pic:blipFill>
+                  <pic:spPr bwMode="auto">
+                    <a:xfrm>
+                      <a:off x="0" y="0"/>
+                      <a:ext cx="2747658" cy="2990065"/>
+                    </a:xfrm>
+                    <a:prstGeom prst="rect">
+                      <a:avLst/>
+                    </a:prstGeom>
+                    <a:noFill/>
+                    <a:ln>
+                      <a:noFill/>
+                    </a:ln>
+                  </pic:spPr>
+                </pic:pic>
+              </a:graphicData>
+            </a:graphic>
+          </wp:inline>
+        </w:drawing>
+      </w:r>
+    </w:p>
+    <w:p>
+      <w:pPr>
+        <w:pStyle w:val="affa"/>
+        <w:rPr>
+          <w:color w:val="FF0000"/>
+        </w:rPr>
+      </w:pPr>
+      <w:bookmarkStart w:id="147" w:name="_Ref229955465"/>
+      <w:r>
+        <w:rPr>
+          <w:color w:val="FF0000"/>
+        </w:rPr>
+        <w:t xml:space="preserve">Рис. </w:t>
+      </w:r>
+      <w:r>
+        <w:rPr>
+          <w:color w:val="FF0000"/>
+        </w:rPr>
+        <w:fldChar w:fldCharType="begin"/>
+      </w:r>
+      <w:r>
+        <w:rPr>
+          <w:color w:val="FF0000"/>
+        </w:rPr>
+        <w:instrText xml:space="preserve"> SEQ Рис. \* ARABIC </w:instrText>
+      </w:r>
+      <w:r>
+        <w:rPr>
+          <w:color w:val="FF0000"/>
+        </w:rPr>
+        <w:fldChar w:fldCharType="separate"/>
+      </w:r>
+      <w:r>
+        <w:rPr>
+          <w:noProof/>
+          <w:color w:val="FF0000"/>
+        </w:rPr>
+        <w:t>7</w:t>
+      </w:r>
+      <w:r>
+        <w:rPr>
+          <w:color w:val="FF0000"/>
+        </w:rPr>
+        <w:fldChar w:fldCharType="end"/>
+      </w:r>
+      <w:bookmarkEnd w:id="147"/>
+      <w:r>
+        <w:rPr>
+          <w:color w:val="FF0000"/>
+        </w:rPr>
+        <w:t>. Структурная схема архитектуры приложения</w:t>
+      </w:r>
+    </w:p>
+    <w:p>
+      <w:pPr>
+        <w:pStyle w:val="ab"/>
+      </w:pPr>
+      <w:r>
+        <w:t>В рамках данной схемы, проект можно поделить на 5 компонентов, которые взаимодействуют друг с другом следующим образом:</w:t>
+      </w:r>
+    </w:p>
+    <w:p>
+      <w:pPr>
+        <w:pStyle w:val="ab"/>
+      </w:pPr>
+      <w:r>
+        <w:t xml:space="preserve">1. </w:t>
+      </w:r>
+      <w:r>
+        <w:t>Сторонний сервис</w:t>
+      </w:r>
+      <w:r>
+        <w:t xml:space="preserve"> – </w:t>
+      </w:r>
+      <w:r>
+        <w:t xml:space="preserve">это </w:t>
+      </w:r>
+      <w:r>
+        <w:t>платформы-агрегаторы</w:t>
+      </w:r>
+      <w:r>
+        <w:t xml:space="preserve"> (мессенджеры, социальные сети и др.)</w:t>
+      </w:r>
+      <w:r>
+        <w:t xml:space="preserve">, </w:t>
+      </w:r>
+      <w:r>
+        <w:t>которые предоставляют механизм безопасной аутентификации пользователей без необходимости создания отдельных учетных записей в разрабатываемой системе.</w:t>
+      </w:r>
+      <w:r>
+        <w:t xml:space="preserve"> </w:t>
+      </w:r>
+      <w:r>
+        <w:t>Он подтверждает личность пользователя и передает разрабатываемой системе минимально необходимый набор данных</w:t>
+      </w:r>
+      <w:r>
+        <w:t>.</w:t>
+      </w:r>
+    </w:p>
+    <w:p>
+      <w:pPr>
+        <w:pStyle w:val="ab"/>
+        <w:rPr>
+          <w:noProof/>
+        </w:rPr>
+      </w:pPr>
+      <w:r>
+        <w:t xml:space="preserve">2. </w:t>
+      </w:r>
+      <w:r>
+        <w:t xml:space="preserve">Клиент - </w:t>
+      </w:r>
+      <w:r>
+        <w:t>клиентская часть интернет-приложения.</w:t>
+      </w:r>
+      <w:r>
+        <w:t xml:space="preserve"> </w:t>
+      </w:r>
+      <w:r>
+        <w:t xml:space="preserve">Этот компонент отвечает за отображение пользовательского интерфейса приложения и обеспечивает возможность взаимодействия пользователя с ним. Интернет-приложение реализует </w:t>
+      </w:r>
+      <w:r>
+        <w:t>4</w:t>
+      </w:r>
+      <w:r>
+        <w:t xml:space="preserve"> уровня </w:t>
+      </w:r>
+      <w:r>
+        <w:t>связи</w:t>
+      </w:r>
+      <w:r>
+        <w:t xml:space="preserve"> с пользовател</w:t>
+      </w:r>
+      <w:r>
+        <w:t>я и сервиса</w:t>
+      </w:r>
+      <w:r>
+        <w:t>.</w:t>
+      </w:r>
+      <w:r>
+        <w:rPr>
+          <w:noProof/>
+        </w:rPr>
+        <w:t xml:space="preserve"> </w:t>
+      </w:r>
+    </w:p>
+    <w:p>
+      <w:pPr>
+        <w:pStyle w:val="ab"/>
+        <w:keepNext/>
+        <w:ind w:firstLine="0"/>
+        <w:jc w:val="center"/>
+      </w:pPr>
+      <w:r>
+        <w:rPr>
+          <w:noProof/>
+        </w:rPr>
+        <w:lastRenderedPageBreak/>
+        <w:drawing>
+          <wp:inline distT="0" distB="0" distL="0" distR="0" wp14:anchorId="01900E87" wp14:editId="0E89F23D">
+            <wp:extent cx="2870200" cy="1066800"/>
+            <wp:effectExtent l="0" t="0" r="6350" b="0"/>
+            <wp:docPr id="9" name="Рисунок 9"/>
+            <wp:cNvGraphicFramePr>
+              <a:graphicFrameLocks xmlns:a="http://schemas.openxmlformats.org/drawingml/2006/main" noChangeAspect="1"/>
+            </wp:cNvGraphicFramePr>
+            <a:graphic xmlns:a="http://schemas.openxmlformats.org/drawingml/2006/main">
+              <a:graphicData uri="http://schemas.openxmlformats.org/drawingml/2006/picture">
+                <pic:pic xmlns:pic="http://schemas.openxmlformats.org/drawingml/2006/picture">
+                  <pic:nvPicPr>
+                    <pic:cNvPr id="0" name="Picture 2"/>
+                    <pic:cNvPicPr>
+                      <a:picLocks noChangeAspect="1" noChangeArrowheads="1"/>
+                    </pic:cNvPicPr>
+                  </pic:nvPicPr>
+                  <pic:blipFill>
+                    <a:blip r:embed="rId16">
+                      <a:extLst>
+                        <a:ext uri="{28A0092B-C50C-407E-A947-70E740481C1C}">
+                          <a14:useLocalDpi xmlns:a14="http://schemas.microsoft.com/office/drawing/2010/main" val="0"/>
+                        </a:ext>
+                      </a:extLst>
+                    </a:blip>
+                    <a:srcRect/>
+                    <a:stretch>
+                      <a:fillRect/>
+                    </a:stretch>
+                  </pic:blipFill>
+                  <pic:spPr bwMode="auto">
+                    <a:xfrm>
+                      <a:off x="0" y="0"/>
+                      <a:ext cx="2870200" cy="1066800"/>
+                    </a:xfrm>
+                    <a:prstGeom prst="rect">
+                      <a:avLst/>
+                    </a:prstGeom>
+                    <a:noFill/>
+                    <a:ln>
+                      <a:noFill/>
+                    </a:ln>
+                  </pic:spPr>
+                </pic:pic>
+              </a:graphicData>
+            </a:graphic>
+          </wp:inline>
+        </w:drawing>
+      </w:r>
+    </w:p>
+    <w:p>
+      <w:pPr>
+        <w:pStyle w:val="affa"/>
+        <w:rPr>
+          <w:color w:val="FF0000"/>
+        </w:rPr>
+      </w:pPr>
+      <w:r>
+        <w:rPr>
+          <w:color w:val="FF0000"/>
+        </w:rPr>
+        <w:t xml:space="preserve">Рис. </w:t>
+      </w:r>
+      <w:r>
+        <w:rPr>
+          <w:color w:val="FF0000"/>
+        </w:rPr>
+        <w:fldChar w:fldCharType="begin"/>
+      </w:r>
+      <w:r>
+        <w:rPr>
+          <w:color w:val="FF0000"/>
+        </w:rPr>
+        <w:instrText xml:space="preserve"> SEQ Рис. \* ARABIC </w:instrText>
+      </w:r>
+      <w:r>
+        <w:rPr>
+          <w:color w:val="FF0000"/>
+        </w:rPr>
+        <w:fldChar w:fldCharType="separate"/>
+      </w:r>
+      <w:r>
+        <w:rPr>
+          <w:noProof/>
+          <w:color w:val="FF0000"/>
+        </w:rPr>
+        <w:t>8</w:t>
+      </w:r>
+      <w:r>
+        <w:rPr>
+          <w:color w:val="FF0000"/>
+        </w:rPr>
+        <w:fldChar w:fldCharType="end"/>
+      </w:r>
+      <w:r>
+        <w:rPr>
+          <w:color w:val="FF0000"/>
+        </w:rPr>
+        <w:t>. Уровни взаимодействия с клиентом</w:t>
+      </w:r>
+    </w:p>
+    <w:p>
+      <w:pPr>
+        <w:pStyle w:val="ab"/>
+      </w:pPr>
+      <w:r>
+        <w:t>Первый уровень</w:t>
+      </w:r>
+      <w:r>
+        <w:t>, или</w:t>
+      </w:r>
+      <w:r>
+        <w:t xml:space="preserve"> </w:t>
+      </w:r>
+      <w:r>
+        <w:t>г</w:t>
+      </w:r>
+      <w:r>
+        <w:t>остевой доступ</w:t>
+      </w:r>
+      <w:r>
+        <w:t>, п</w:t>
+      </w:r>
+      <w:r>
+        <w:t>редназначен для неавторизованных посетителей. На этом этапе пользователю доступен ограниченный функционал: ознакомление с описанием сервиса, переход на публичные списки желаний в режиме «только чтение» (скрыты цены и контакты владельца), а также инициирование процесса авторизации через сторонние провайдеры.</w:t>
+      </w:r>
+    </w:p>
+    <w:p>
+      <w:pPr>
+        <w:pStyle w:val="ab"/>
+      </w:pPr>
+      <w:r>
+        <w:t>Второй уровень</w:t>
+      </w:r>
+      <w:r>
+        <w:t>,</w:t>
+      </w:r>
+      <w:r>
+        <w:t xml:space="preserve"> </w:t>
+      </w:r>
+      <w:r>
+        <w:t>или п</w:t>
+      </w:r>
+      <w:r>
+        <w:t xml:space="preserve">ользовательский режим </w:t>
+      </w:r>
+      <w:r>
+        <w:t>д</w:t>
+      </w:r>
+      <w:r>
+        <w:t>арител</w:t>
+      </w:r>
+      <w:r>
+        <w:t>я</w:t>
+      </w:r>
+      <w:r>
+        <w:t>, а</w:t>
+      </w:r>
+      <w:r>
+        <w:t>ктивируется после успешной авторизации. Пользователь получает полный доступ к функциям поиска и выбора подарков</w:t>
+      </w:r>
+      <w:r>
+        <w:t xml:space="preserve">: </w:t>
+      </w:r>
+      <w:r>
+        <w:t>глобальный семантический поиск по базе подарков, просмотр детальной информации о товарах в списках других пользователей, функция бронирования позиций</w:t>
+      </w:r>
+      <w:r>
+        <w:t xml:space="preserve">, </w:t>
+      </w:r>
+      <w:r>
+        <w:t xml:space="preserve">отметка об участии в совместном дарении. </w:t>
+      </w:r>
+    </w:p>
+    <w:p>
+      <w:pPr>
+        <w:pStyle w:val="ab"/>
+      </w:pPr>
+      <w:r>
+        <w:t>Третий уровень</w:t>
+      </w:r>
+      <w:r>
+        <w:t>, или уровень</w:t>
+      </w:r>
+      <w:r>
+        <w:t xml:space="preserve"> владельца списка</w:t>
+      </w:r>
+      <w:r>
+        <w:t>, п</w:t>
+      </w:r>
+      <w:r>
+        <w:t xml:space="preserve">редоставляет расширенные права управления собственными данными. Владелец списка может создавать и </w:t>
+      </w:r>
+      <w:proofErr w:type="spellStart"/>
+      <w:r>
+        <w:t>кастомизировать</w:t>
+      </w:r>
+      <w:proofErr w:type="spellEnd"/>
+      <w:r>
+        <w:t xml:space="preserve"> новые списки событий, добавлять, редактировать или удалять карточки подарков, загружать изображения, устанавливать параметры видимости.</w:t>
+      </w:r>
+    </w:p>
+    <w:p>
+      <w:pPr>
+        <w:pStyle w:val="ab"/>
+      </w:pPr>
+      <w:r>
+        <w:t>Четвертый уровень</w:t>
+      </w:r>
+      <w:r>
+        <w:t>, или а</w:t>
+      </w:r>
+      <w:r>
+        <w:t>дминистративный режим</w:t>
+      </w:r>
+      <w:r>
+        <w:t>, п</w:t>
+      </w:r>
+      <w:r>
+        <w:t>редназначен для модераторов системы. Включает инструменты управления глобальной базой знаний подарков, мониторинг активности пользователей и разрешение спорных ситуаций.</w:t>
+      </w:r>
+    </w:p>
+    <w:p>
+      <w:pPr>
+        <w:pStyle w:val="ab"/>
+      </w:pPr>
+      <w:r>
+        <w:t>3</w:t>
+      </w:r>
+      <w:r>
+        <w:t>. Сервер – серверная часть интернет-приложения.</w:t>
+      </w:r>
+      <w:r>
+        <w:t xml:space="preserve"> </w:t>
+      </w:r>
+      <w:r>
+        <w:t>Он выступает в роли посредника между клиентской частью, базой данных и интеллектуальным модулем, обеспечивая безопасность, валидацию данных и координацию всех процессов.</w:t>
+      </w:r>
+    </w:p>
+    <w:p>
+      <w:pPr>
+        <w:pStyle w:val="ab"/>
+        <w:keepNext/>
+        <w:ind w:firstLine="0"/>
+        <w:jc w:val="center"/>
+      </w:pPr>
+      <w:r>
+        <w:rPr>
+          <w:noProof/>
+        </w:rPr>
+        <w:lastRenderedPageBreak/>
+        <w:drawing>
+          <wp:inline distT="0" distB="0" distL="0" distR="0" wp14:anchorId="7740A96B" wp14:editId="5E6B4AEE">
+            <wp:extent cx="4411134" cy="4535677"/>
+            <wp:effectExtent l="0" t="0" r="8890" b="0"/>
+            <wp:docPr id="10" name="Рисунок 10"/>
+            <wp:cNvGraphicFramePr>
+              <a:graphicFrameLocks xmlns:a="http://schemas.openxmlformats.org/drawingml/2006/main" noChangeAspect="1"/>
+            </wp:cNvGraphicFramePr>
+            <a:graphic xmlns:a="http://schemas.openxmlformats.org/drawingml/2006/main">
+              <a:graphicData uri="http://schemas.openxmlformats.org/drawingml/2006/picture">
+                <pic:pic xmlns:pic="http://schemas.openxmlformats.org/drawingml/2006/picture">
+                  <pic:nvPicPr>
+                    <pic:cNvPr id="0" name="Picture 3"/>
+                    <pic:cNvPicPr>
+                      <a:picLocks noChangeAspect="1" noChangeArrowheads="1"/>
+                    </pic:cNvPicPr>
+                  </pic:nvPicPr>
+                  <pic:blipFill>
+                    <a:blip r:embed="rId17">
+                      <a:extLst>
+                        <a:ext uri="{28A0092B-C50C-407E-A947-70E740481C1C}">
+                          <a14:useLocalDpi xmlns:a14="http://schemas.microsoft.com/office/drawing/2010/main" val="0"/>
+                        </a:ext>
+                      </a:extLst>
+                    </a:blip>
+                    <a:srcRect/>
+                    <a:stretch>
+                      <a:fillRect/>
+                    </a:stretch>
+                  </pic:blipFill>
+                  <pic:spPr bwMode="auto">
+                    <a:xfrm>
+                      <a:off x="0" y="0"/>
+                      <a:ext cx="4412866" cy="4537458"/>
+                    </a:xfrm>
+                    <a:prstGeom prst="rect">
+                      <a:avLst/>
+                    </a:prstGeom>
+                    <a:noFill/>
+                    <a:ln>
+                      <a:noFill/>
+                    </a:ln>
+                  </pic:spPr>
+                </pic:pic>
+              </a:graphicData>
+            </a:graphic>
+          </wp:inline>
+        </w:drawing>
+      </w:r>
+    </w:p>
+    <w:p>
+      <w:pPr>
+        <w:pStyle w:val="affa"/>
+      </w:pPr>
+      <w:r>
+        <w:t xml:space="preserve">Рис. </w:t>
+      </w:r>
+      <w:r>
+        <w:fldChar w:fldCharType="begin"/>
+      </w:r>
+      <w:r>
+        <w:instrText xml:space="preserve"> SEQ Рис. \* ARABIC </w:instrText>
+      </w:r>
+      <w:r>
+        <w:fldChar w:fldCharType="separate"/>
+      </w:r>
+      <w:r>
+        <w:rPr>
+          <w:noProof/>
+        </w:rPr>
+        <w:t>9</w:t>
+      </w:r>
+      <w:r>
+        <w:fldChar w:fldCharType="end"/>
+      </w:r>
+      <w:r>
+        <w:t xml:space="preserve">. </w:t>
+      </w:r>
+      <w:r>
+        <w:t>Архитектура сервера интернет-приложения</w:t>
+      </w:r>
+    </w:p>
+    <w:p>
+      <w:pPr>
+        <w:pStyle w:val="ab"/>
+      </w:pPr>
+      <w:r>
+        <w:t xml:space="preserve">Модуль </w:t>
+      </w:r>
+      <w:r>
+        <w:t>и</w:t>
+      </w:r>
+      <w:r>
+        <w:t>нициализации</w:t>
+      </w:r>
+      <w:r>
+        <w:t xml:space="preserve"> о</w:t>
+      </w:r>
+      <w:r>
+        <w:t>твечает за запуск приложения. При старте загружает переменные окружения, устанавливает асинхронные соединения с базой данных и регистрирует все необходимые зависимости для внедрения в контроллеры.</w:t>
+      </w:r>
+    </w:p>
+    <w:p>
+      <w:pPr>
+        <w:pStyle w:val="ab"/>
+      </w:pPr>
+      <w:r>
+        <w:t xml:space="preserve">Модуль </w:t>
+      </w:r>
+      <w:r>
+        <w:t>м</w:t>
+      </w:r>
+      <w:r>
+        <w:t xml:space="preserve">аршрутов </w:t>
+      </w:r>
+      <w:r>
+        <w:t>о</w:t>
+      </w:r>
+      <w:r>
+        <w:t xml:space="preserve">пределяет структуру API и точки входа. Маршруты группируются по функциональным областям: авторизация, списки, подарки, рекомендации. Каждый маршрут принимает запрос, </w:t>
+      </w:r>
+      <w:proofErr w:type="spellStart"/>
+      <w:r>
+        <w:t>валидирует</w:t>
+      </w:r>
+      <w:proofErr w:type="spellEnd"/>
+      <w:r>
+        <w:t xml:space="preserve"> входные данные и передает управление соответствующему контроллеру.</w:t>
+      </w:r>
+    </w:p>
+    <w:p>
+      <w:pPr>
+        <w:pStyle w:val="ab"/>
+      </w:pPr>
+      <w:r>
+        <w:t xml:space="preserve">Модуль </w:t>
+      </w:r>
+      <w:r>
+        <w:t>б</w:t>
+      </w:r>
+      <w:r>
+        <w:t xml:space="preserve">езопасности </w:t>
+      </w:r>
+      <w:r>
+        <w:t>о</w:t>
+      </w:r>
+      <w:r>
+        <w:t>брабатывает процессы аутентификации и авторизации. Проверяет валидность токенов доступа, декодирует информацию о пользователе и определяет его права доступа.</w:t>
+      </w:r>
+    </w:p>
+    <w:p>
+      <w:pPr>
+        <w:pStyle w:val="ab"/>
+      </w:pPr>
+      <w:r>
+        <w:t>Модуль</w:t>
+      </w:r>
+      <w:r>
+        <w:t xml:space="preserve"> </w:t>
+      </w:r>
+      <w:r>
+        <w:t>к</w:t>
+      </w:r>
+      <w:r>
+        <w:t>онтроллеров</w:t>
+      </w:r>
+      <w:r>
+        <w:t xml:space="preserve"> с</w:t>
+      </w:r>
+      <w:r>
+        <w:t xml:space="preserve">одержит основную логику приложения. Здесь реализуются алгоритмы создания и редактирования списков, проверки условий </w:t>
+      </w:r>
+      <w:r>
+        <w:lastRenderedPageBreak/>
+        <w:t>бронирования, управления статусами складчин. Именно контроллер формирует запросы к внешнему интеллектуальному модулю, подготавливая необходимые данные и интерпретируя полученные результаты перед отправкой клиенту.</w:t>
+      </w:r>
+    </w:p>
+    <w:p>
+      <w:pPr>
+        <w:pStyle w:val="ab"/>
+      </w:pPr>
+      <w:r>
+        <w:t xml:space="preserve">Модуль </w:t>
+      </w:r>
+      <w:r>
+        <w:t>д</w:t>
+      </w:r>
+      <w:r>
+        <w:t xml:space="preserve">оступа к </w:t>
+      </w:r>
+      <w:r>
+        <w:t>д</w:t>
+      </w:r>
+      <w:r>
+        <w:t xml:space="preserve">анным </w:t>
+      </w:r>
+      <w:r>
+        <w:t xml:space="preserve">обеспечивает взаимодействие приложения с </w:t>
+      </w:r>
+      <w:r>
+        <w:t>базой данных</w:t>
+      </w:r>
+      <w:r>
+        <w:t>. Он преобразует внутренние объекты приложения в команды для системы хранения данных и обратно. Также модуль гарантируя целостность данных: при возникновении ошибки все изменения в рамках одной операции откатываются.</w:t>
+      </w:r>
+    </w:p>
+    <w:p>
+      <w:pPr>
+        <w:pStyle w:val="ab"/>
+      </w:pPr>
+      <w:r>
+        <w:t>Обработчик интеллектуального модуля с</w:t>
+      </w:r>
+      <w:r>
+        <w:t>пециализированный подмодуль, отвечающий за коммуникацию с интеллектуальным модулем рекомендаций. Реализует механизм вызова</w:t>
+      </w:r>
+      <w:r>
+        <w:t>,</w:t>
+      </w:r>
+      <w:r>
+        <w:t xml:space="preserve"> передачу параметров и получение списка рекомендованных подарков.</w:t>
+      </w:r>
+    </w:p>
+    <w:p>
+      <w:pPr>
+        <w:pStyle w:val="ab"/>
+      </w:pPr>
+      <w:r>
+        <w:t xml:space="preserve">Модуль </w:t>
+      </w:r>
+      <w:r>
+        <w:t>о</w:t>
+      </w:r>
+      <w:r>
+        <w:t xml:space="preserve">бработки </w:t>
+      </w:r>
+      <w:r>
+        <w:t>о</w:t>
+      </w:r>
+      <w:r>
+        <w:t>шибок</w:t>
+      </w:r>
+      <w:r>
+        <w:t xml:space="preserve"> п</w:t>
+      </w:r>
+      <w:r>
+        <w:t>ерехватывает исключения, возникающие на любом уровне работы сервера. Преобразует технические ошибки в стандартизированные JSON-ответы с понятными кодами статуса</w:t>
+      </w:r>
+      <w:r>
+        <w:t xml:space="preserve"> </w:t>
+      </w:r>
+      <w:r>
+        <w:t>и сообщениями для клиента, предотвращая утечку внутренней информации об архитектуре.</w:t>
+      </w:r>
+    </w:p>
+    <w:p>
+      <w:pPr>
+        <w:pStyle w:val="ab"/>
+      </w:pPr>
+      <w:r>
+        <w:t xml:space="preserve">4. Интеллектуальный модуль - </w:t>
+      </w:r>
+    </w:p>
+    <w:p>
+      <w:pPr>
+        <w:pStyle w:val="ab"/>
+        <w:ind w:firstLine="0"/>
+        <w:jc w:val="center"/>
+      </w:pPr>
     </w:p>
     <w:sectPr>
-      <w:footerReference w:type="default" r:id="rId15"/>
+      <w:footerReference w:type="default" r:id="rId18"/>
       <w:pgSz w:w="11906" w:h="16838" w:code="9"/>
       <w:pgMar w:top="1134" w:right="567" w:bottom="1134" w:left="1701" w:header="709" w:footer="709" w:gutter="0"/>
       <w:cols w:space="708"/>

</xml_diff>

<commit_message>
Updated graphs and docs
</commit_message>
<xml_diff>
--- a/Docs/Основное/РПЗ Диплом ШаруновРД.docx
+++ b/Docs/Основное/РПЗ Диплом ШаруновРД.docx
@@ -118,6 +118,13 @@
     </w:p>
     <w:sdt>
       <w:sdtPr>
+        <w:rPr>
+          <w:rFonts w:asciiTheme="minorHAnsi" w:eastAsiaTheme="minorHAnsi" w:hAnsiTheme="minorHAnsi" w:cstheme="minorBidi"/>
+          <w:color w:val="auto"/>
+          <w:sz w:val="22"/>
+          <w:szCs w:val="22"/>
+          <w:lang w:eastAsia="en-US"/>
+        </w:rPr>
         <w:id w:val="1079642250"/>
         <w:docPartObj>
           <w:docPartGallery w:val="Table of Contents"/>
@@ -126,13 +133,8 @@
       </w:sdtPr>
       <w:sdtEndPr>
         <w:rPr>
-          <w:rFonts w:asciiTheme="minorHAnsi" w:eastAsiaTheme="minorHAnsi" w:hAnsiTheme="minorHAnsi" w:cstheme="minorBidi"/>
           <w:b/>
           <w:bCs/>
-          <w:color w:val="auto"/>
-          <w:sz w:val="22"/>
-          <w:szCs w:val="22"/>
-          <w:lang w:eastAsia="en-US"/>
         </w:rPr>
       </w:sdtEndPr>
       <w:sdtContent>
@@ -510,21 +512,7 @@
                 <w:rStyle w:val="afc"/>
                 <w:noProof/>
               </w:rPr>
-              <w:t>1.5. Обоснование</w:t>
-            </w:r>
-            <w:r>
-              <w:rPr>
-                <w:rStyle w:val="afc"/>
-                <w:noProof/>
-              </w:rPr>
-              <w:t xml:space="preserve"> </w:t>
-            </w:r>
-            <w:r>
-              <w:rPr>
-                <w:rStyle w:val="afc"/>
-                <w:noProof/>
-              </w:rPr>
-              <w:t>выбора инструментов и платформы разработки</w:t>
+              <w:t>1.5. Обоснование выбора инструментов и платформы разработки</w:t>
             </w:r>
             <w:r>
               <w:rPr>
@@ -729,21 +717,7 @@
                 <w:rStyle w:val="afc"/>
                 <w:noProof/>
               </w:rPr>
-              <w:t>2.1. Разработка стру</w:t>
-            </w:r>
-            <w:r>
-              <w:rPr>
-                <w:rStyle w:val="afc"/>
-                <w:noProof/>
-              </w:rPr>
-              <w:t>к</w:t>
-            </w:r>
-            <w:r>
-              <w:rPr>
-                <w:rStyle w:val="afc"/>
-                <w:noProof/>
-              </w:rPr>
-              <w:t>туры приложения</w:t>
+              <w:t>2.1. Разработка структуры приложения</w:t>
             </w:r>
             <w:r>
               <w:rPr>
@@ -1286,7 +1260,13 @@
         <w:t>вещей</w:t>
       </w:r>
       <w:r>
-        <w:t xml:space="preserve"> от разных гостей, трудностями при организации коллективного финансирования дорогостоящих </w:t>
+        <w:t xml:space="preserve"> от разных гостей, трудностями при организации коллективного </w:t>
+      </w:r>
+      <w:r>
+        <w:t>дарения</w:t>
+      </w:r>
+      <w:r>
+        <w:t xml:space="preserve"> </w:t>
       </w:r>
       <w:r>
         <w:t>товаров</w:t>
@@ -2885,6 +2865,9 @@
         <w:t>5</w:t>
       </w:r>
       <w:r>
+        <w:rPr>
+          <w:noProof/>
+        </w:rPr>
         <w:fldChar w:fldCharType="end"/>
       </w:r>
       <w:bookmarkEnd w:id="86"/>
@@ -3661,6 +3644,9 @@
         <w:t>6</w:t>
       </w:r>
       <w:r>
+        <w:rPr>
+          <w:noProof/>
+        </w:rPr>
         <w:fldChar w:fldCharType="end"/>
       </w:r>
       <w:r>
@@ -5453,7 +5439,21 @@
           <w:sz w:val="28"/>
         </w:rPr>
         <w:lastRenderedPageBreak/>
-        <w:t>Пользователи должны иметь возможность редактировать настройки приватности профиля, управлять видимостью списков и добавлять информацию о своих интересах для работы рекомендательной системы.</w:t>
+        <w:t xml:space="preserve">Пользователи должны иметь возможность редактировать настройки приватности профиля, управлять видимостью списков и </w:t>
+      </w:r>
+      <w:r>
+        <w:rPr>
+          <w:rFonts w:ascii="Times New Roman" w:hAnsi="Times New Roman"/>
+          <w:sz w:val="28"/>
+        </w:rPr>
+        <w:t>видимостью своего профиля</w:t>
+      </w:r>
+      <w:r>
+        <w:rPr>
+          <w:rFonts w:ascii="Times New Roman" w:hAnsi="Times New Roman"/>
+          <w:sz w:val="28"/>
+        </w:rPr>
+        <w:t>.</w:t>
       </w:r>
     </w:p>
     <w:p>
@@ -5702,7 +5702,6 @@
           <w:rFonts w:ascii="Times New Roman" w:hAnsi="Times New Roman"/>
           <w:sz w:val="28"/>
         </w:rPr>
-        <w:lastRenderedPageBreak/>
         <w:t>Система должна осуществлять глобальный семантический поиск подарков по базе знаний, понимая смысловое содержание запроса, а не только точное совпадение ключевых слов.</w:t>
       </w:r>
     </w:p>
@@ -5725,6 +5724,7 @@
           <w:rFonts w:ascii="Times New Roman" w:hAnsi="Times New Roman"/>
           <w:sz w:val="28"/>
         </w:rPr>
+        <w:lastRenderedPageBreak/>
         <w:t>Система должна автоматически генерировать персонализированные идеи подарков для владельца списка на основе указанных им интересов и истории поведения.</w:t>
       </w:r>
     </w:p>
@@ -5985,7 +5985,6 @@
           <w:rFonts w:ascii="Times New Roman" w:hAnsi="Times New Roman"/>
           <w:sz w:val="28"/>
         </w:rPr>
-        <w:lastRenderedPageBreak/>
         <w:t>Приложение должно быть профессионально протестировано перед релизом.</w:t>
       </w:r>
     </w:p>
@@ -6032,6 +6031,7 @@
           <w:rFonts w:ascii="Times New Roman" w:hAnsi="Times New Roman"/>
           <w:sz w:val="28"/>
         </w:rPr>
+        <w:lastRenderedPageBreak/>
         <w:t xml:space="preserve">При разработке автоматизированной системы необходимо пройти следующие этапы: </w:t>
       </w:r>
     </w:p>
@@ -6407,7 +6407,6 @@
           <w:b/>
           <w:bCs/>
         </w:rPr>
-        <w:lastRenderedPageBreak/>
         <w:t>Источники разработки</w:t>
       </w:r>
       <w:bookmarkEnd w:id="147"/>
@@ -6437,6 +6436,7 @@
           <w:rFonts w:ascii="Times New Roman" w:hAnsi="Times New Roman"/>
           <w:sz w:val="28"/>
         </w:rPr>
+        <w:lastRenderedPageBreak/>
         <w:t>ГОСТ 34.601-90 «Информационная технология. Комплекс стандартов на автоматизированные системы. Автоматизированные системы. Стадии создания».</w:t>
       </w:r>
     </w:p>
@@ -6624,6 +6624,9 @@
         <w:t>8</w:t>
       </w:r>
       <w:r>
+        <w:rPr>
+          <w:noProof/>
+        </w:rPr>
         <w:fldChar w:fldCharType="end"/>
       </w:r>
       <w:bookmarkEnd w:id="157"/>
@@ -6642,6 +6645,7 @@
     <w:p>
       <w:pPr>
         <w:pStyle w:val="ab"/>
+        <w:spacing w:before="240"/>
       </w:pPr>
       <w:r>
         <w:t xml:space="preserve">1. </w:t>
@@ -6680,6 +6684,7 @@
     <w:p>
       <w:pPr>
         <w:pStyle w:val="ab"/>
+        <w:spacing w:before="240"/>
         <w:rPr>
           <w:noProof/>
         </w:rPr>
@@ -6788,6 +6793,9 @@
         <w:t>9</w:t>
       </w:r>
       <w:r>
+        <w:rPr>
+          <w:noProof/>
+        </w:rPr>
         <w:fldChar w:fldCharType="end"/>
       </w:r>
       <w:r>
@@ -6848,15 +6856,25 @@
         <w:t>, п</w:t>
       </w:r>
       <w:r>
-        <w:t xml:space="preserve">редоставляет расширенные права управления собственными данными. Владелец списка может создавать и </w:t>
-      </w:r>
-      <w:proofErr w:type="spellStart"/>
-      <w:r>
-        <w:t>кастомизировать</w:t>
-      </w:r>
-      <w:proofErr w:type="spellEnd"/>
-      <w:r>
-        <w:t xml:space="preserve"> новые списки событий, добавлять, редактировать или удалять карточки подарков, загружать изображения, устанавливать параметры видимости.</w:t>
+        <w:t>редоставляет расширенные права управления собственными данными. Владелец</w:t>
+      </w:r>
+      <w:r>
+        <w:t xml:space="preserve"> </w:t>
+      </w:r>
+      <w:r>
+        <w:t xml:space="preserve">может создавать и </w:t>
+      </w:r>
+      <w:r>
+        <w:t>настраивать</w:t>
+      </w:r>
+      <w:r>
+        <w:t xml:space="preserve"> новые списки </w:t>
+      </w:r>
+      <w:r>
+        <w:t>желаний</w:t>
+      </w:r>
+      <w:r>
+        <w:t>, добавлять, редактировать или удалять карточки подарков, загружать изображения, устанавливать параметры видимости.</w:t>
       </w:r>
     </w:p>
     <w:p>
@@ -6882,6 +6900,7 @@
     <w:p>
       <w:pPr>
         <w:pStyle w:val="ab"/>
+        <w:spacing w:before="240"/>
       </w:pPr>
       <w:r>
         <w:t>3</w:t>
@@ -6978,6 +6997,9 @@
         <w:t>10</w:t>
       </w:r>
       <w:r>
+        <w:rPr>
+          <w:noProof/>
+        </w:rPr>
         <w:fldChar w:fldCharType="end"/>
       </w:r>
       <w:r>
@@ -7209,6 +7231,9 @@
         <w:t>11</w:t>
       </w:r>
       <w:r>
+        <w:rPr>
+          <w:noProof/>
+        </w:rPr>
         <w:fldChar w:fldCharType="end"/>
       </w:r>
       <w:r>
@@ -7647,6 +7672,9 @@
         <w:t>12</w:t>
       </w:r>
       <w:r>
+        <w:rPr>
+          <w:noProof/>
+        </w:rPr>
         <w:fldChar w:fldCharType="end"/>
       </w:r>
       <w:bookmarkEnd w:id="158"/>
@@ -7716,10 +7744,7 @@
         <w:t xml:space="preserve">. Переходы между ними инициируются действиями пользователей и наглядно демонстрируют логику работы системы бронирования и </w:t>
       </w:r>
       <w:r>
-        <w:t>совместного дарения</w:t>
-      </w:r>
-      <w:r>
-        <w:t>.</w:t>
+        <w:t>совместного дарения.</w:t>
       </w:r>
     </w:p>
     <w:p>
@@ -7735,7 +7760,26 @@
         <w:pStyle w:val="ab"/>
       </w:pPr>
       <w:r>
-        <w:t>При отмене бронирования первым, кто инициировал бронь, или изменениях названия и описания подарка создателем карточки, состояние возвращается к статусу «Свободен».</w:t>
+        <w:t>При отмене бронирования первым, кто инициировал бронь, или изменениях названия и описания подарка</w:t>
+      </w:r>
+      <w:r>
+        <w:t xml:space="preserve">, а </w:t>
+      </w:r>
+      <w:proofErr w:type="spellStart"/>
+      <w:r>
+        <w:t>ткаже</w:t>
+      </w:r>
+      <w:proofErr w:type="spellEnd"/>
+      <w:r>
+        <w:t xml:space="preserve"> изменения статуса видимости </w:t>
+      </w:r>
+      <w:proofErr w:type="spellStart"/>
+      <w:r>
+        <w:t>ссписка</w:t>
+      </w:r>
+      <w:proofErr w:type="spellEnd"/>
+      <w:r>
+        <w:t xml:space="preserve"> создателем карточки, состояние возвращается к статусу «Свободен».</w:t>
       </w:r>
     </w:p>
     <w:p>
@@ -7772,16 +7816,7 @@
       </w:r>
       <w:r>
         <w:softHyphen/>
-        <w:t>–</w:t>
-      </w:r>
-      <w:r>
-        <w:t xml:space="preserve"> </w:t>
-      </w:r>
-      <w:r>
-        <w:t>с</w:t>
-      </w:r>
-      <w:r>
-        <w:t>оздатель карточки. Не может бронировать свой подарок. Имеет исключительное право переводить статус в «Подарен» (подтверждение получения) или возвращать его в «Свободен» (отмена получения/сброс статуса).</w:t>
+        <w:t>– создатель карточки. Не может бронировать свой подарок. Имеет исключительное право переводить статус в «Подарен» (подтверждение получения) или возвращать его в «Свободен» (отмена получения/сброс статуса).</w:t>
       </w:r>
     </w:p>
     <w:p>
@@ -7884,7 +7919,13 @@
         </w:numPr>
       </w:pPr>
       <w:r>
-        <w:t>Добавление и редактирование Карточки подарка</w:t>
+        <w:t xml:space="preserve">Добавление и редактирование </w:t>
+      </w:r>
+      <w:r>
+        <w:t>к</w:t>
+      </w:r>
+      <w:r>
+        <w:t>арточки подарка</w:t>
       </w:r>
     </w:p>
     <w:p>
@@ -8029,6 +8070,9 @@
         <w:t>13</w:t>
       </w:r>
       <w:r>
+        <w:rPr>
+          <w:noProof/>
+        </w:rPr>
         <w:fldChar w:fldCharType="end"/>
       </w:r>
       <w:r>
@@ -8426,6 +8470,9 @@
         <w:t>14</w:t>
       </w:r>
       <w:r>
+        <w:rPr>
+          <w:noProof/>
+        </w:rPr>
         <w:fldChar w:fldCharType="end"/>
       </w:r>
       <w:r>
@@ -8623,6 +8670,9 @@
         <w:t>15</w:t>
       </w:r>
       <w:r>
+        <w:rPr>
+          <w:noProof/>
+        </w:rPr>
         <w:fldChar w:fldCharType="end"/>
       </w:r>
       <w:r>
@@ -8869,6 +8919,9 @@
         <w:t>16</w:t>
       </w:r>
       <w:r>
+        <w:rPr>
+          <w:noProof/>
+        </w:rPr>
         <w:fldChar w:fldCharType="end"/>
       </w:r>
       <w:r>
@@ -9121,6 +9174,9 @@
         <w:t>17</w:t>
       </w:r>
       <w:r>
+        <w:rPr>
+          <w:noProof/>
+        </w:rPr>
         <w:fldChar w:fldCharType="end"/>
       </w:r>
       <w:r>
@@ -9272,13 +9328,7 @@
         <w:t>есть</w:t>
       </w:r>
       <w:r>
-        <w:t xml:space="preserve"> ли статуса «</w:t>
-      </w:r>
-      <w:r>
-        <w:t>Ожидает подтверждения</w:t>
-      </w:r>
-      <w:r>
-        <w:t>»</w:t>
+        <w:t xml:space="preserve"> ли статуса «Ожидает подтверждения»</w:t>
       </w:r>
       <w:r>
         <w:t xml:space="preserve">. Если </w:t>
@@ -9442,6 +9492,9 @@
         <w:t>18</w:t>
       </w:r>
       <w:r>
+        <w:rPr>
+          <w:noProof/>
+        </w:rPr>
         <w:fldChar w:fldCharType="end"/>
       </w:r>
       <w:r>
@@ -9456,15 +9509,27 @@
         <w:pStyle w:val="ab"/>
       </w:pPr>
       <w:r>
-        <w:t>Пользователь открывает раздел «Идеи» или выполняет поиск. Сервер формирует запрос к Интеллектуальному модулю, передавая ID пользователя и контекст (например, фильтр по категории или празднику).</w:t>
-      </w:r>
-    </w:p>
-    <w:p>
-      <w:pPr>
-        <w:pStyle w:val="ab"/>
-      </w:pPr>
-      <w:r>
-        <w:t>Модуль запрашивает в БД историю действий пользователя (созданные списки, забронированные подарки, указанные интересы) и формирует его профиль предпочтений.</w:t>
+        <w:t>Пользователь открывает раздел «</w:t>
+      </w:r>
+      <w:r>
+        <w:t>Рекомендации</w:t>
+      </w:r>
+      <w:r>
+        <w:t>» или выполняет поиск. Сервер формирует запрос к Интеллектуальному модулю, передавая ID пользователя и контекст (например, фильтр по категории или празднику).</w:t>
+      </w:r>
+    </w:p>
+    <w:p>
+      <w:pPr>
+        <w:pStyle w:val="ab"/>
+      </w:pPr>
+      <w:r>
+        <w:t xml:space="preserve">Модуль </w:t>
+      </w:r>
+      <w:r>
+        <w:t>запрашивает историю активности пользователя. Каждому действию присваивается весовой коэффициент, определяющий его влияние на профиль интересов</w:t>
+      </w:r>
+      <w:r>
+        <w:t>.</w:t>
       </w:r>
     </w:p>
     <w:p>
@@ -9529,7 +9594,31 @@
         <w:pStyle w:val="ab"/>
       </w:pPr>
       <w:r>
-        <w:t>Полученные списки кандидатов объединяются. Из итогового списка исключаются:</w:t>
+        <w:t>Полученные списки кандидатов объединяются.</w:t>
+      </w:r>
+      <w:r>
+        <w:t xml:space="preserve"> И</w:t>
+      </w:r>
+      <w:r>
+        <w:t>тогов</w:t>
+      </w:r>
+      <w:r>
+        <w:t>ый</w:t>
+      </w:r>
+      <w:r>
+        <w:t xml:space="preserve"> спис</w:t>
+      </w:r>
+      <w:r>
+        <w:t>о</w:t>
+      </w:r>
+      <w:r>
+        <w:t xml:space="preserve">к </w:t>
+      </w:r>
+      <w:r>
+        <w:t>фильтруется</w:t>
+      </w:r>
+      <w:r>
+        <w:t>:</w:t>
       </w:r>
     </w:p>
     <w:p>
@@ -9541,7 +9630,10 @@
         </w:numPr>
       </w:pPr>
       <w:r>
-        <w:t>Подарки, уже присутствующие в списках желаний пользователя.</w:t>
+        <w:t>Удаляются товары, которые пользователь уже добавил в свои списки</w:t>
+      </w:r>
+      <w:r>
+        <w:t>;</w:t>
       </w:r>
     </w:p>
     <w:p>
@@ -9553,19 +9645,22 @@
         </w:numPr>
       </w:pPr>
       <w:r>
-        <w:t>Подарки, которые пользователь уже забронировал или купил.</w:t>
-      </w:r>
-    </w:p>
-    <w:p>
-      <w:pPr>
-        <w:pStyle w:val="ab"/>
-        <w:numPr>
-          <w:ilvl w:val="0"/>
-          <w:numId w:val="25"/>
-        </w:numPr>
-      </w:pPr>
-      <w:r>
-        <w:t>Некорректные или удаленные позиции.</w:t>
+        <w:t>Для каждого кандидата проверяется семантическое сходство с товарами из текущих списков пользователя</w:t>
+      </w:r>
+      <w:r>
+        <w:t>, где определяются похожие товары с уже существующими.</w:t>
+      </w:r>
+      <w:r>
+        <w:t xml:space="preserve"> Если сходство слишком велико, то т</w:t>
+      </w:r>
+      <w:r>
+        <w:t>овар помечается флагом «Уже есть похожее» и понижается в выдаче</w:t>
+      </w:r>
+      <w:r>
+        <w:t xml:space="preserve">, иначе кандидат </w:t>
+      </w:r>
+      <w:r>
+        <w:t>считается уникальной идеей и остается в основной ленте.</w:t>
       </w:r>
     </w:p>
     <w:p>
@@ -9579,7 +9674,19 @@
         <w:t xml:space="preserve"> и</w:t>
       </w:r>
       <w:r>
-        <w:t xml:space="preserve"> возвращается в Сервер для отображения пользователю.</w:t>
+        <w:t xml:space="preserve"> возвраща</w:t>
+      </w:r>
+      <w:r>
+        <w:t>ю</w:t>
+      </w:r>
+      <w:r>
+        <w:t xml:space="preserve">тся </w:t>
+      </w:r>
+      <w:r>
+        <w:t>на</w:t>
+      </w:r>
+      <w:r>
+        <w:t xml:space="preserve"> Сервер для отображения пользователю.</w:t>
       </w:r>
     </w:p>
     <w:p>
@@ -9730,6 +9837,9 @@
         <w:t>19</w:t>
       </w:r>
       <w:r>
+        <w:rPr>
+          <w:noProof/>
+        </w:rPr>
         <w:fldChar w:fldCharType="end"/>
       </w:r>
       <w:r>
@@ -9824,7 +9934,22 @@
         <w:t xml:space="preserve"> вычисляется векторное представление.</w:t>
       </w:r>
       <w:r>
-        <w:t xml:space="preserve"> Эти</w:t>
+        <w:t xml:space="preserve"> </w:t>
+      </w:r>
+      <w:r>
+        <w:t>Кроме того,</w:t>
+      </w:r>
+      <w:r>
+        <w:t xml:space="preserve"> создаются товары для системы, чтобы наполнить </w:t>
+      </w:r>
+      <w:r>
+        <w:t xml:space="preserve">её </w:t>
+      </w:r>
+      <w:r>
+        <w:t xml:space="preserve">первичными подарками. </w:t>
+      </w:r>
+      <w:r>
+        <w:t>Эти</w:t>
       </w:r>
       <w:r>
         <w:t xml:space="preserve"> данные вместе с полученными векторами сохраняются в баз</w:t>
@@ -9991,6 +10116,9 @@
         <w:t>20</w:t>
       </w:r>
       <w:r>
+        <w:rPr>
+          <w:noProof/>
+        </w:rPr>
         <w:fldChar w:fldCharType="end"/>
       </w:r>
       <w:r>
@@ -10078,7 +10206,19 @@
         <w:pStyle w:val="ab"/>
       </w:pPr>
       <w:r>
-        <w:t>Сущность «Списки желаний» представляет собой логический контейнер для подарков. Она содержит название списка, текстовое описание, изображение обложки и дату создания.</w:t>
+        <w:t>Сущность «Списки желаний» представляет собой логический контейнер для подарков. Она содержит название списка, текстовое описание, изображение обложки</w:t>
+      </w:r>
+      <w:r>
+        <w:t>,</w:t>
+      </w:r>
+      <w:r>
+        <w:t xml:space="preserve"> дату создания</w:t>
+      </w:r>
+      <w:r>
+        <w:t xml:space="preserve"> и состояние видимости другим пользователям</w:t>
+      </w:r>
+      <w:r>
+        <w:t>.</w:t>
       </w:r>
       <w:r>
         <w:t xml:space="preserve"> </w:t>
@@ -10158,6 +10298,7 @@
     <w:p>
       <w:pPr>
         <w:pStyle w:val="a3"/>
+        <w:spacing w:before="240"/>
       </w:pPr>
       <w:bookmarkStart w:id="163" w:name="_Toc230123770"/>
       <w:r>
@@ -10251,6 +10392,9 @@
         <w:t>21</w:t>
       </w:r>
       <w:r>
+        <w:rPr>
+          <w:noProof/>
+        </w:rPr>
         <w:fldChar w:fldCharType="end"/>
       </w:r>
       <w:r>
@@ -10562,6 +10706,7 @@
     <w:p>
       <w:pPr>
         <w:pStyle w:val="ab"/>
+        <w:spacing w:before="240"/>
       </w:pPr>
       <w:r>
         <w:t>Сущность</w:t>
@@ -10876,6 +11021,7 @@
     <w:p>
       <w:pPr>
         <w:pStyle w:val="ab"/>
+        <w:spacing w:before="240"/>
       </w:pPr>
       <w:r>
         <w:t>Сущность</w:t>
@@ -11265,12 +11411,52 @@
         <w:rPr>
           <w:lang w:val="en-US"/>
         </w:rPr>
-        <w:t>)).</w:t>
-      </w:r>
-    </w:p>
-    <w:p>
-      <w:pPr>
-        <w:pStyle w:val="ab"/>
+        <w:t>))</w:t>
+      </w:r>
+      <w:r>
+        <w:rPr>
+          <w:lang w:val="en-US"/>
+        </w:rPr>
+        <w:t>;</w:t>
+      </w:r>
+    </w:p>
+    <w:p>
+      <w:pPr>
+        <w:pStyle w:val="ab"/>
+        <w:numPr>
+          <w:ilvl w:val="0"/>
+          <w:numId w:val="27"/>
+        </w:numPr>
+      </w:pPr>
+      <w:r>
+        <w:rPr>
+          <w:lang w:val="en-US"/>
+        </w:rPr>
+        <w:t>visibility</w:t>
+      </w:r>
+      <w:r>
+        <w:t xml:space="preserve"> – </w:t>
+      </w:r>
+      <w:r>
+        <w:t>параметр видимости списка (</w:t>
+      </w:r>
+      <w:r>
+        <w:rPr>
+          <w:lang w:val="en-US"/>
+        </w:rPr>
+        <w:t>string</w:t>
+      </w:r>
+      <w:r>
+        <w:t>)</w:t>
+      </w:r>
+      <w:r>
+        <w:t>.</w:t>
+      </w:r>
+    </w:p>
+    <w:p>
+      <w:pPr>
+        <w:pStyle w:val="ab"/>
+        <w:spacing w:before="240"/>
       </w:pPr>
       <w:r>
         <w:t>Сущность</w:t>
@@ -11643,43 +11829,16 @@
           <w:ilvl w:val="0"/>
           <w:numId w:val="28"/>
         </w:numPr>
-        <w:rPr>
-          <w:lang w:val="en-US"/>
-        </w:rPr>
-      </w:pPr>
-      <w:r>
-        <w:rPr>
-          <w:lang w:val="en-US"/>
-        </w:rPr>
-        <w:t xml:space="preserve">status – </w:t>
-      </w:r>
-      <w:proofErr w:type="spellStart"/>
-      <w:r>
-        <w:rPr>
-          <w:lang w:val="en-US"/>
-        </w:rPr>
-        <w:t>текущий</w:t>
-      </w:r>
-      <w:proofErr w:type="spellEnd"/>
-      <w:r>
-        <w:rPr>
-          <w:lang w:val="en-US"/>
-        </w:rPr>
-        <w:t xml:space="preserve"> </w:t>
-      </w:r>
-      <w:proofErr w:type="spellStart"/>
-      <w:r>
-        <w:rPr>
-          <w:lang w:val="en-US"/>
-        </w:rPr>
-        <w:t>статус</w:t>
-      </w:r>
-      <w:proofErr w:type="spellEnd"/>
-      <w:r>
-        <w:rPr>
-          <w:lang w:val="en-US"/>
-        </w:rPr>
-        <w:t xml:space="preserve"> (string, default: 'available', values: 'available', 'reserved', 'purchased');</w:t>
+      </w:pPr>
+      <w:r>
+        <w:rPr>
+          <w:lang w:val="en-US"/>
+        </w:rPr>
+        <w:lastRenderedPageBreak/>
+        <w:t>embedding</w:t>
+      </w:r>
+      <w:r>
+        <w:t xml:space="preserve"> – векторное представление описания для семантического поиска;</w:t>
       </w:r>
     </w:p>
     <w:p>
@@ -11689,105 +11848,61 @@
           <w:ilvl w:val="0"/>
           <w:numId w:val="28"/>
         </w:numPr>
-      </w:pPr>
-      <w:r>
-        <w:rPr>
-          <w:lang w:val="en-US"/>
-        </w:rPr>
-        <w:lastRenderedPageBreak/>
-        <w:t>embedding</w:t>
-      </w:r>
-      <w:r>
-        <w:t xml:space="preserve"> – векторное представление описания для семантического поиска (</w:t>
+        <w:rPr>
+          <w:lang w:val="en-US"/>
+        </w:rPr>
+      </w:pPr>
+      <w:proofErr w:type="spellStart"/>
+      <w:r>
+        <w:rPr>
+          <w:lang w:val="en-US"/>
+        </w:rPr>
+        <w:t>created_at</w:t>
+      </w:r>
+      <w:proofErr w:type="spellEnd"/>
+      <w:r>
+        <w:rPr>
+          <w:lang w:val="en-US"/>
+        </w:rPr>
+        <w:t xml:space="preserve"> – </w:t>
+      </w:r>
+      <w:proofErr w:type="spellStart"/>
+      <w:r>
+        <w:rPr>
+          <w:lang w:val="en-US"/>
+        </w:rPr>
+        <w:t>дата</w:t>
+      </w:r>
+      <w:proofErr w:type="spellEnd"/>
+      <w:r>
+        <w:rPr>
+          <w:lang w:val="en-US"/>
+        </w:rPr>
+        <w:t xml:space="preserve"> </w:t>
+      </w:r>
+      <w:proofErr w:type="spellStart"/>
+      <w:r>
+        <w:rPr>
+          <w:lang w:val="en-US"/>
+        </w:rPr>
+        <w:t>добавления</w:t>
+      </w:r>
+      <w:proofErr w:type="spellEnd"/>
+      <w:r>
+        <w:rPr>
+          <w:lang w:val="en-US"/>
+        </w:rPr>
+        <w:t xml:space="preserve"> (timestamp, default: </w:t>
       </w:r>
       <w:proofErr w:type="gramStart"/>
       <w:r>
         <w:rPr>
           <w:lang w:val="en-US"/>
         </w:rPr>
-        <w:t>vector</w:t>
-      </w:r>
-      <w:r>
-        <w:t>(</w:t>
+        <w:t>now(</w:t>
       </w:r>
       <w:proofErr w:type="gramEnd"/>
       <w:r>
-        <w:t xml:space="preserve">768), используется расширением </w:t>
-      </w:r>
-      <w:proofErr w:type="spellStart"/>
-      <w:r>
-        <w:rPr>
-          <w:lang w:val="en-US"/>
-        </w:rPr>
-        <w:t>pgvector</w:t>
-      </w:r>
-      <w:proofErr w:type="spellEnd"/>
-      <w:r>
-        <w:t>);</w:t>
-      </w:r>
-    </w:p>
-    <w:p>
-      <w:pPr>
-        <w:pStyle w:val="ab"/>
-        <w:numPr>
-          <w:ilvl w:val="0"/>
-          <w:numId w:val="28"/>
-        </w:numPr>
-        <w:rPr>
-          <w:lang w:val="en-US"/>
-        </w:rPr>
-      </w:pPr>
-      <w:proofErr w:type="spellStart"/>
-      <w:r>
-        <w:rPr>
-          <w:lang w:val="en-US"/>
-        </w:rPr>
-        <w:t>created_at</w:t>
-      </w:r>
-      <w:proofErr w:type="spellEnd"/>
-      <w:r>
-        <w:rPr>
-          <w:lang w:val="en-US"/>
-        </w:rPr>
-        <w:t xml:space="preserve"> – </w:t>
-      </w:r>
-      <w:proofErr w:type="spellStart"/>
-      <w:r>
-        <w:rPr>
-          <w:lang w:val="en-US"/>
-        </w:rPr>
-        <w:t>дата</w:t>
-      </w:r>
-      <w:proofErr w:type="spellEnd"/>
-      <w:r>
-        <w:rPr>
-          <w:lang w:val="en-US"/>
-        </w:rPr>
-        <w:t xml:space="preserve"> </w:t>
-      </w:r>
-      <w:proofErr w:type="spellStart"/>
-      <w:r>
-        <w:rPr>
-          <w:lang w:val="en-US"/>
-        </w:rPr>
-        <w:t>добавления</w:t>
-      </w:r>
-      <w:proofErr w:type="spellEnd"/>
-      <w:r>
-        <w:rPr>
-          <w:lang w:val="en-US"/>
-        </w:rPr>
-        <w:t xml:space="preserve"> (timestamp, default: </w:t>
-      </w:r>
-      <w:proofErr w:type="gramStart"/>
-      <w:r>
-        <w:rPr>
-          <w:lang w:val="en-US"/>
-        </w:rPr>
-        <w:t>now(</w:t>
-      </w:r>
-      <w:proofErr w:type="gramEnd"/>
-      <w:r>
         <w:rPr>
           <w:lang w:val="en-US"/>
         </w:rPr>
@@ -11797,6 +11912,7 @@
     <w:p>
       <w:pPr>
         <w:pStyle w:val="ab"/>
+        <w:spacing w:before="240"/>
       </w:pPr>
       <w:r>
         <w:t>Сущность</w:t>
@@ -11929,7 +12045,13 @@
       </w:r>
       <w:proofErr w:type="spellEnd"/>
       <w:r>
-        <w:t xml:space="preserve"> – опциональная подсказка категории для группировки (</w:t>
+        <w:t xml:space="preserve"> –</w:t>
+      </w:r>
+      <w:r>
+        <w:t xml:space="preserve"> </w:t>
+      </w:r>
+      <w:r>
+        <w:t>подсказка категории для группировки (</w:t>
       </w:r>
       <w:proofErr w:type="spellStart"/>
       <w:r>
@@ -11943,6 +12065,7 @@
     <w:p>
       <w:pPr>
         <w:pStyle w:val="ab"/>
+        <w:spacing w:before="240"/>
       </w:pPr>
       <w:r>
         <w:t>Сущность</w:t>
@@ -12264,7 +12387,7 @@
         <w:rPr>
           <w:lang w:val="en-US"/>
         </w:rPr>
-        <w:t xml:space="preserve"> (string, default: 'individual', values: 'individual', 'group');</w:t>
+        <w:t xml:space="preserve"> (string);</w:t>
       </w:r>
     </w:p>
     <w:p>
@@ -12320,6 +12443,39 @@
           <w:ilvl w:val="0"/>
           <w:numId w:val="30"/>
         </w:numPr>
+      </w:pPr>
+      <w:r>
+        <w:rPr>
+          <w:lang w:val="en-US"/>
+        </w:rPr>
+        <w:t>status</w:t>
+      </w:r>
+      <w:r>
+        <w:t xml:space="preserve"> – </w:t>
+      </w:r>
+      <w:r>
+        <w:t>текущий статус бронирования (</w:t>
+      </w:r>
+      <w:r>
+        <w:rPr>
+          <w:lang w:val="en-US"/>
+        </w:rPr>
+        <w:t>string</w:t>
+      </w:r>
+      <w:r>
+        <w:t>)</w:t>
+      </w:r>
+      <w:r>
+        <w:t>;</w:t>
+      </w:r>
+    </w:p>
+    <w:p>
+      <w:pPr>
+        <w:pStyle w:val="ab"/>
+        <w:numPr>
+          <w:ilvl w:val="0"/>
+          <w:numId w:val="30"/>
+        </w:numPr>
         <w:rPr>
           <w:lang w:val="en-US"/>
         </w:rPr>
@@ -12384,6 +12540,7 @@
     <w:p>
       <w:pPr>
         <w:pStyle w:val="ab"/>
+        <w:spacing w:before="240"/>
       </w:pPr>
       <w:r>
         <w:t>Сущность «</w:t>
@@ -12488,34 +12645,7 @@
     <w:p>
       <w:pPr>
         <w:pStyle w:val="ab"/>
-        <w:numPr>
-          <w:ilvl w:val="0"/>
-          <w:numId w:val="31"/>
-        </w:numPr>
-      </w:pPr>
-      <w:r>
-        <w:t>Первичный ключ: составной (</w:t>
-      </w:r>
-      <w:proofErr w:type="spellStart"/>
-      <w:r>
-        <w:t>gift_id</w:t>
-      </w:r>
-      <w:proofErr w:type="spellEnd"/>
-      <w:r>
-        <w:t xml:space="preserve">, </w:t>
-      </w:r>
-      <w:proofErr w:type="spellStart"/>
-      <w:r>
-        <w:t>tag_id</w:t>
-      </w:r>
-      <w:proofErr w:type="spellEnd"/>
-      <w:r>
-        <w:t>).</w:t>
-      </w:r>
-    </w:p>
-    <w:p>
-      <w:pPr>
-        <w:pStyle w:val="ab"/>
+        <w:spacing w:before="240"/>
       </w:pPr>
       <w:r>
         <w:lastRenderedPageBreak/>
@@ -12649,48 +12779,13 @@
       </w:r>
       <w:proofErr w:type="spellEnd"/>
       <w:r>
-        <w:t xml:space="preserve">, </w:t>
-      </w:r>
-      <w:proofErr w:type="spellStart"/>
-      <w:r>
-        <w:t>default</w:t>
-      </w:r>
-      <w:proofErr w:type="spellEnd"/>
-      <w:r>
-        <w:t>: 1.0, используется для ранжирования рекомендаций);</w:t>
-      </w:r>
-    </w:p>
-    <w:p>
-      <w:pPr>
-        <w:pStyle w:val="ab"/>
-        <w:numPr>
-          <w:ilvl w:val="0"/>
-          <w:numId w:val="32"/>
-        </w:numPr>
-      </w:pPr>
-      <w:r>
-        <w:t>Первичный ключ: составной (</w:t>
-      </w:r>
-      <w:proofErr w:type="spellStart"/>
-      <w:r>
-        <w:t>user_id</w:t>
-      </w:r>
-      <w:proofErr w:type="spellEnd"/>
-      <w:r>
-        <w:t xml:space="preserve">, </w:t>
-      </w:r>
-      <w:proofErr w:type="spellStart"/>
-      <w:r>
-        <w:t>tag_id</w:t>
-      </w:r>
-      <w:proofErr w:type="spellEnd"/>
-      <w:r>
-        <w:t>).</w:t>
+        <w:t>);</w:t>
       </w:r>
     </w:p>
     <w:p>
       <w:pPr>
         <w:pStyle w:val="a3"/>
+        <w:spacing w:before="240"/>
       </w:pPr>
       <w:bookmarkStart w:id="164" w:name="_Toc230123771"/>
       <w:r>
@@ -12798,6 +12893,9 @@
         <w:t>22</w:t>
       </w:r>
       <w:r>
+        <w:rPr>
+          <w:noProof/>
+        </w:rPr>
         <w:fldChar w:fldCharType="end"/>
       </w:r>
       <w:r>
@@ -12807,6 +12905,7 @@
     <w:p>
       <w:pPr>
         <w:pStyle w:val="ab"/>
+        <w:spacing w:before="240"/>
       </w:pPr>
       <w:r>
         <w:t xml:space="preserve">1. </w:t>
@@ -12882,6 +12981,7 @@
     <w:p>
       <w:pPr>
         <w:pStyle w:val="ab"/>
+        <w:spacing w:before="240"/>
       </w:pPr>
       <w:r>
         <w:lastRenderedPageBreak/>
@@ -12915,6 +13015,102 @@
     <w:p>
       <w:pPr>
         <w:pStyle w:val="ab"/>
+        <w:keepNext/>
+        <w:ind w:firstLine="0"/>
+        <w:jc w:val="center"/>
+      </w:pPr>
+      <w:r>
+        <w:rPr>
+          <w:noProof/>
+        </w:rPr>
+        <w:drawing>
+          <wp:inline distT="0" distB="0" distL="0" distR="0" wp14:anchorId="6E5F172F" wp14:editId="0470CE0E">
+            <wp:extent cx="1735136" cy="3771900"/>
+            <wp:effectExtent l="0" t="0" r="0" b="0"/>
+            <wp:docPr id="24" name="Рисунок 24"/>
+            <wp:cNvGraphicFramePr>
+              <a:graphicFrameLocks xmlns:a="http://schemas.openxmlformats.org/drawingml/2006/main" noChangeAspect="1"/>
+            </wp:cNvGraphicFramePr>
+            <a:graphic xmlns:a="http://schemas.openxmlformats.org/drawingml/2006/main">
+              <a:graphicData uri="http://schemas.openxmlformats.org/drawingml/2006/picture">
+                <pic:pic xmlns:pic="http://schemas.openxmlformats.org/drawingml/2006/picture">
+                  <pic:nvPicPr>
+                    <pic:cNvPr id="0" name="Picture 1"/>
+                    <pic:cNvPicPr>
+                      <a:picLocks noChangeAspect="1" noChangeArrowheads="1"/>
+                    </pic:cNvPicPr>
+                  </pic:nvPicPr>
+                  <pic:blipFill>
+                    <a:blip r:embed="rId31">
+                      <a:extLst>
+                        <a:ext uri="{28A0092B-C50C-407E-A947-70E740481C1C}">
+                          <a14:useLocalDpi xmlns:a14="http://schemas.microsoft.com/office/drawing/2010/main" val="0"/>
+                        </a:ext>
+                      </a:extLst>
+                    </a:blip>
+                    <a:srcRect/>
+                    <a:stretch>
+                      <a:fillRect/>
+                    </a:stretch>
+                  </pic:blipFill>
+                  <pic:spPr bwMode="auto">
+                    <a:xfrm>
+                      <a:off x="0" y="0"/>
+                      <a:ext cx="1740569" cy="3783710"/>
+                    </a:xfrm>
+                    <a:prstGeom prst="rect">
+                      <a:avLst/>
+                    </a:prstGeom>
+                    <a:noFill/>
+                    <a:ln>
+                      <a:noFill/>
+                    </a:ln>
+                  </pic:spPr>
+                </pic:pic>
+              </a:graphicData>
+            </a:graphic>
+          </wp:inline>
+        </w:drawing>
+      </w:r>
+    </w:p>
+    <w:p>
+      <w:pPr>
+        <w:pStyle w:val="affa"/>
+      </w:pPr>
+      <w:r>
+        <w:t xml:space="preserve">Рис. </w:t>
+      </w:r>
+      <w:r>
+        <w:fldChar w:fldCharType="begin"/>
+      </w:r>
+      <w:r>
+        <w:instrText xml:space="preserve"> SEQ Рис. \* ARABIC </w:instrText>
+      </w:r>
+      <w:r>
+        <w:fldChar w:fldCharType="separate"/>
+      </w:r>
+      <w:r>
+        <w:rPr>
+          <w:noProof/>
+        </w:rPr>
+        <w:t>23</w:t>
+      </w:r>
+      <w:r>
+        <w:rPr>
+          <w:noProof/>
+        </w:rPr>
+        <w:fldChar w:fldCharType="end"/>
+      </w:r>
+      <w:r>
+        <w:t xml:space="preserve"> –</w:t>
+      </w:r>
+      <w:r>
+        <w:t>Макет "Главная"</w:t>
+      </w:r>
+    </w:p>
+    <w:p>
+      <w:pPr>
+        <w:pStyle w:val="ab"/>
       </w:pPr>
       <w:r>
         <w:t>«</w:t>
@@ -12972,6 +13168,23 @@
         <w:pStyle w:val="ab"/>
       </w:pPr>
       <w:r>
+        <w:t>Контейнер «Отмеченные подарки» появляется, если есть участие в бронировании какого-либо подарка для другого пользователя. Это позво</w:t>
+      </w:r>
+      <w:r>
+        <w:t xml:space="preserve">лит явно уведомлять пользователя </w:t>
+      </w:r>
+      <w:r>
+        <w:t xml:space="preserve">и не дать забыть </w:t>
+      </w:r>
+      <w:r>
+        <w:t>об его планах на дарение.</w:t>
+      </w:r>
+    </w:p>
+    <w:p>
+      <w:pPr>
+        <w:pStyle w:val="ab"/>
+      </w:pPr>
+      <w:r>
         <w:t>Контейнер «</w:t>
       </w:r>
       <w:r>
@@ -12984,14 +13197,16 @@
         <w:t xml:space="preserve"> – г</w:t>
       </w:r>
       <w:r>
-        <w:t>оризонтальная лента (карусель), содержащая карточки подарков, сгенерированные алгоритмом рекомендаций на основе интересов пользователя и его истории действий. Карточки содержат изображение, название и кнопку быстрого действия («Добавить в список»).</w:t>
-      </w:r>
-    </w:p>
-    <w:p>
-      <w:pPr>
-        <w:pStyle w:val="ab"/>
-      </w:pPr>
-      <w:r>
+        <w:t>оризонтальная лента (карусель), содержащая карточки подарков, сгенерированные алгоритмом рекомендаций на основе интересов пользователя и его истории действий</w:t>
+      </w:r>
+    </w:p>
+    <w:p>
+      <w:pPr>
+        <w:pStyle w:val="ab"/>
+        <w:spacing w:before="240"/>
+      </w:pPr>
+      <w:r>
+        <w:lastRenderedPageBreak/>
         <w:t>3</w:t>
       </w:r>
       <w:r>
@@ -13076,14 +13291,7 @@
     <w:p>
       <w:pPr>
         <w:pStyle w:val="ab"/>
-      </w:pPr>
-      <w:r>
-        <w:t>Функциональное назначение: Активный поиск идей, исследование ассортимента, поиск аналогов.</w:t>
-      </w:r>
-    </w:p>
-    <w:p>
-      <w:pPr>
-        <w:pStyle w:val="ab"/>
+        <w:spacing w:before="240"/>
       </w:pPr>
       <w:r>
         <w:t xml:space="preserve">4. </w:t>
@@ -13098,13 +13306,7 @@
         <w:t>е</w:t>
       </w:r>
       <w:r>
-        <w:t xml:space="preserve"> «</w:t>
-      </w:r>
-      <w:r>
-        <w:t>Подписки</w:t>
-      </w:r>
-      <w:r>
-        <w:t>»</w:t>
+        <w:t xml:space="preserve"> «Подписки»</w:t>
       </w:r>
       <w:r>
         <w:t xml:space="preserve"> пользователь отслеживает обновления в списках желаний близких людей. </w:t>
@@ -13147,57 +13349,153 @@
         <w:pStyle w:val="ab"/>
       </w:pPr>
       <w:r>
+        <w:t>Режим «Мои подписки»</w:t>
+      </w:r>
+      <w:r>
+        <w:t xml:space="preserve"> – это </w:t>
+      </w:r>
+      <w:r>
+        <w:t>список карточек пользователей, на которых оформлена подписка.</w:t>
+      </w:r>
+    </w:p>
+    <w:p>
+      <w:pPr>
+        <w:pStyle w:val="ab"/>
+        <w:spacing w:before="240"/>
+      </w:pPr>
+      <w:r>
+        <w:t>5</w:t>
+      </w:r>
+      <w:r>
+        <w:t>. Мои списки</w:t>
+      </w:r>
+      <w:r>
+        <w:t xml:space="preserve"> позволяет </w:t>
+      </w:r>
+      <w:r>
+        <w:t>управл</w:t>
+      </w:r>
+      <w:r>
+        <w:t>ять</w:t>
+      </w:r>
+      <w:r>
+        <w:t xml:space="preserve"> личными </w:t>
+      </w:r>
+      <w:r>
+        <w:t>коллекциями подарков</w:t>
+      </w:r>
+      <w:r>
+        <w:t>.</w:t>
+      </w:r>
+    </w:p>
+    <w:p>
+      <w:pPr>
+        <w:pStyle w:val="ab"/>
+      </w:pPr>
+      <w:r>
+        <w:t xml:space="preserve">Список моих </w:t>
+      </w:r>
+      <w:proofErr w:type="spellStart"/>
+      <w:r>
+        <w:t>вишлистов</w:t>
+      </w:r>
+      <w:proofErr w:type="spellEnd"/>
+      <w:r>
+        <w:t>: Главный экран раздела отображает вертикальный список всех созданных пользователем коллекций. Каждый элемент содержит обложку, название, количество предметов и дату обновления. Присутствует кнопка для создания нового списка.</w:t>
+      </w:r>
+    </w:p>
+    <w:p>
+      <w:pPr>
+        <w:pStyle w:val="ab"/>
+        <w:keepNext/>
+        <w:ind w:firstLine="0"/>
+        <w:jc w:val="center"/>
+      </w:pPr>
+      <w:r>
+        <w:rPr>
+          <w:noProof/>
+        </w:rPr>
         <w:lastRenderedPageBreak/>
-        <w:t>Режим «Мои подписки»</w:t>
-      </w:r>
-      <w:r>
-        <w:t xml:space="preserve"> – это </w:t>
-      </w:r>
-      <w:r>
-        <w:t>список карточек пользователей, на которых оформлена подписка.</w:t>
-      </w:r>
-    </w:p>
-    <w:p>
-      <w:pPr>
-        <w:pStyle w:val="ab"/>
-      </w:pPr>
-      <w:r>
-        <w:t>5</w:t>
-      </w:r>
-      <w:r>
-        <w:t>. Мои списки (Управление личными коллекциями)</w:t>
-      </w:r>
-    </w:p>
-    <w:p>
-      <w:pPr>
-        <w:pStyle w:val="ab"/>
-      </w:pPr>
-      <w:r>
-        <w:t xml:space="preserve">Центр управления личными данными пользователя. Здесь хранятся созданные пользователем </w:t>
-      </w:r>
-      <w:proofErr w:type="spellStart"/>
-      <w:r>
-        <w:t>вишлисты</w:t>
-      </w:r>
-      <w:proofErr w:type="spellEnd"/>
-      <w:r>
-        <w:t>.</w:t>
-      </w:r>
-    </w:p>
-    <w:p>
-      <w:pPr>
-        <w:pStyle w:val="ab"/>
-      </w:pPr>
-      <w:r>
-        <w:t xml:space="preserve">Список моих </w:t>
-      </w:r>
-      <w:proofErr w:type="spellStart"/>
-      <w:r>
-        <w:t>вишлистов</w:t>
-      </w:r>
-      <w:proofErr w:type="spellEnd"/>
-      <w:r>
-        <w:t>: Главный экран раздела отображает вертикальный список всех созданных пользователем коллекций. Каждый элемент содержит обложку, название, количество предметов и дату обновления. Присутствует кнопка «+» для создания нового списка.</w:t>
+        <w:drawing>
+          <wp:inline distT="0" distB="0" distL="0" distR="0" wp14:anchorId="38EB9873" wp14:editId="414437E3">
+            <wp:extent cx="1973580" cy="4290235"/>
+            <wp:effectExtent l="0" t="0" r="7620" b="0"/>
+            <wp:docPr id="25" name="Рисунок 25"/>
+            <wp:cNvGraphicFramePr>
+              <a:graphicFrameLocks xmlns:a="http://schemas.openxmlformats.org/drawingml/2006/main" noChangeAspect="1"/>
+            </wp:cNvGraphicFramePr>
+            <a:graphic xmlns:a="http://schemas.openxmlformats.org/drawingml/2006/main">
+              <a:graphicData uri="http://schemas.openxmlformats.org/drawingml/2006/picture">
+                <pic:pic xmlns:pic="http://schemas.openxmlformats.org/drawingml/2006/picture">
+                  <pic:nvPicPr>
+                    <pic:cNvPr id="0" name="Picture 2"/>
+                    <pic:cNvPicPr>
+                      <a:picLocks noChangeAspect="1" noChangeArrowheads="1"/>
+                    </pic:cNvPicPr>
+                  </pic:nvPicPr>
+                  <pic:blipFill>
+                    <a:blip r:embed="rId32">
+                      <a:extLst>
+                        <a:ext uri="{28A0092B-C50C-407E-A947-70E740481C1C}">
+                          <a14:useLocalDpi xmlns:a14="http://schemas.microsoft.com/office/drawing/2010/main" val="0"/>
+                        </a:ext>
+                      </a:extLst>
+                    </a:blip>
+                    <a:srcRect/>
+                    <a:stretch>
+                      <a:fillRect/>
+                    </a:stretch>
+                  </pic:blipFill>
+                  <pic:spPr bwMode="auto">
+                    <a:xfrm>
+                      <a:off x="0" y="0"/>
+                      <a:ext cx="1979162" cy="4302368"/>
+                    </a:xfrm>
+                    <a:prstGeom prst="rect">
+                      <a:avLst/>
+                    </a:prstGeom>
+                    <a:noFill/>
+                    <a:ln>
+                      <a:noFill/>
+                    </a:ln>
+                  </pic:spPr>
+                </pic:pic>
+              </a:graphicData>
+            </a:graphic>
+          </wp:inline>
+        </w:drawing>
+      </w:r>
+    </w:p>
+    <w:p>
+      <w:pPr>
+        <w:pStyle w:val="affa"/>
+      </w:pPr>
+      <w:r>
+        <w:t xml:space="preserve">Рис. </w:t>
+      </w:r>
+      <w:r>
+        <w:fldChar w:fldCharType="begin"/>
+      </w:r>
+      <w:r>
+        <w:instrText xml:space="preserve"> SEQ Рис. \* ARABIC </w:instrText>
+      </w:r>
+      <w:r>
+        <w:fldChar w:fldCharType="separate"/>
+      </w:r>
+      <w:r>
+        <w:rPr>
+          <w:noProof/>
+        </w:rPr>
+        <w:t>24</w:t>
+      </w:r>
+      <w:r>
+        <w:rPr>
+          <w:noProof/>
+        </w:rPr>
+        <w:fldChar w:fldCharType="end"/>
+      </w:r>
+      <w:r>
+        <w:t xml:space="preserve"> – Макет "Мои списки"</w:t>
       </w:r>
     </w:p>
     <w:p>
@@ -13251,6 +13549,7 @@
     <w:p>
       <w:pPr>
         <w:pStyle w:val="ab"/>
+        <w:spacing w:before="240"/>
       </w:pPr>
       <w:r>
         <w:t>6</w:t>
@@ -13259,24 +13558,169 @@
         <w:t xml:space="preserve">. </w:t>
       </w:r>
       <w:r>
-        <w:t>Раздел «</w:t>
-      </w:r>
-      <w:r>
-        <w:t>Профиль</w:t>
-      </w:r>
-      <w:r>
-        <w:t xml:space="preserve">» нужен </w:t>
-      </w:r>
-      <w:r>
-        <w:t>для управления учетной записью и настройки работы рекомендательной системы.</w:t>
-      </w:r>
-      <w:r>
-        <w:t xml:space="preserve"> Содержит информацию об аккаунте, интересах и настройки приватности. </w:t>
-      </w:r>
-    </w:p>
-    <w:p>
-      <w:pPr>
-        <w:pStyle w:val="ab"/>
+        <w:t>Раздел «Профиль» предназначен для управления учетной записью, настройки конфиденциальности и просмотра персональной аналитики вкусов.</w:t>
+      </w:r>
+      <w:r>
+        <w:t xml:space="preserve"> </w:t>
+      </w:r>
+      <w:r>
+        <w:t>Здесь о</w:t>
+      </w:r>
+      <w:r>
+        <w:t>тобража</w:t>
+      </w:r>
+      <w:r>
+        <w:t>ю</w:t>
+      </w:r>
+      <w:r>
+        <w:t>т</w:t>
+      </w:r>
+      <w:r>
+        <w:t>ся</w:t>
+      </w:r>
+      <w:r>
+        <w:t xml:space="preserve"> аватар, имя и ID</w:t>
+      </w:r>
+      <w:r>
+        <w:t xml:space="preserve"> из внешнего сервиса.</w:t>
+      </w:r>
+    </w:p>
+    <w:p>
+      <w:pPr>
+        <w:pStyle w:val="ab"/>
+        <w:keepNext/>
+        <w:spacing w:before="240"/>
+        <w:ind w:firstLine="0"/>
+        <w:jc w:val="center"/>
+      </w:pPr>
+      <w:r>
+        <w:rPr>
+          <w:noProof/>
+        </w:rPr>
+        <w:lastRenderedPageBreak/>
+        <w:drawing>
+          <wp:inline distT="0" distB="0" distL="0" distR="0" wp14:anchorId="3805F6D6" wp14:editId="6A424B09">
+            <wp:extent cx="1844040" cy="4008641"/>
+            <wp:effectExtent l="0" t="0" r="3810" b="0"/>
+            <wp:docPr id="26" name="Рисунок 26"/>
+            <wp:cNvGraphicFramePr>
+              <a:graphicFrameLocks xmlns:a="http://schemas.openxmlformats.org/drawingml/2006/main" noChangeAspect="1"/>
+            </wp:cNvGraphicFramePr>
+            <a:graphic xmlns:a="http://schemas.openxmlformats.org/drawingml/2006/main">
+              <a:graphicData uri="http://schemas.openxmlformats.org/drawingml/2006/picture">
+                <pic:pic xmlns:pic="http://schemas.openxmlformats.org/drawingml/2006/picture">
+                  <pic:nvPicPr>
+                    <pic:cNvPr id="0" name="Picture 3"/>
+                    <pic:cNvPicPr>
+                      <a:picLocks noChangeAspect="1" noChangeArrowheads="1"/>
+                    </pic:cNvPicPr>
+                  </pic:nvPicPr>
+                  <pic:blipFill>
+                    <a:blip r:embed="rId33">
+                      <a:extLst>
+                        <a:ext uri="{28A0092B-C50C-407E-A947-70E740481C1C}">
+                          <a14:useLocalDpi xmlns:a14="http://schemas.microsoft.com/office/drawing/2010/main" val="0"/>
+                        </a:ext>
+                      </a:extLst>
+                    </a:blip>
+                    <a:srcRect/>
+                    <a:stretch>
+                      <a:fillRect/>
+                    </a:stretch>
+                  </pic:blipFill>
+                  <pic:spPr bwMode="auto">
+                    <a:xfrm>
+                      <a:off x="0" y="0"/>
+                      <a:ext cx="1850100" cy="4021814"/>
+                    </a:xfrm>
+                    <a:prstGeom prst="rect">
+                      <a:avLst/>
+                    </a:prstGeom>
+                    <a:noFill/>
+                    <a:ln>
+                      <a:noFill/>
+                    </a:ln>
+                  </pic:spPr>
+                </pic:pic>
+              </a:graphicData>
+            </a:graphic>
+          </wp:inline>
+        </w:drawing>
+      </w:r>
+    </w:p>
+    <w:p>
+      <w:pPr>
+        <w:pStyle w:val="affa"/>
+      </w:pPr>
+      <w:r>
+        <w:t xml:space="preserve">Рис. </w:t>
+      </w:r>
+      <w:r>
+        <w:fldChar w:fldCharType="begin"/>
+      </w:r>
+      <w:r>
+        <w:instrText xml:space="preserve"> SEQ Рис. \* ARABIC </w:instrText>
+      </w:r>
+      <w:r>
+        <w:fldChar w:fldCharType="separate"/>
+      </w:r>
+      <w:r>
+        <w:rPr>
+          <w:noProof/>
+        </w:rPr>
+        <w:t>25</w:t>
+      </w:r>
+      <w:r>
+        <w:rPr>
+          <w:noProof/>
+        </w:rPr>
+        <w:fldChar w:fldCharType="end"/>
+      </w:r>
+      <w:r>
+        <w:t xml:space="preserve"> –</w:t>
+      </w:r>
+      <w:r>
+        <w:t xml:space="preserve"> </w:t>
+      </w:r>
+      <w:r>
+        <w:t>Макет "Профиль"</w:t>
+      </w:r>
+    </w:p>
+    <w:p>
+      <w:pPr>
+        <w:pStyle w:val="ab"/>
+      </w:pPr>
+      <w:r>
+        <w:t>Раздел также показывает</w:t>
+      </w:r>
+      <w:r>
+        <w:t xml:space="preserve"> интересы пользователя, сформированные системой автоматически на основе его активности. Пользователь видит, на чем базируются текущие рекомендации, но не может редактировать их вручную напрямую.</w:t>
+      </w:r>
+    </w:p>
+    <w:p>
+      <w:pPr>
+        <w:pStyle w:val="ab"/>
+      </w:pPr>
+      <w:r>
+        <w:t>Настройки приватности</w:t>
+      </w:r>
+      <w:r>
+        <w:t xml:space="preserve"> позволяют управлять сокрытием от владельца текущего статуса подарков</w:t>
+      </w:r>
+      <w:r>
+        <w:t>,</w:t>
+      </w:r>
+      <w:r>
+        <w:t xml:space="preserve"> менять видимость для других пользователей интересов владельца</w:t>
+      </w:r>
+      <w:r>
+        <w:t xml:space="preserve"> и самого профиля.</w:t>
+      </w:r>
+    </w:p>
+    <w:p>
+      <w:pPr>
+        <w:pStyle w:val="ab"/>
+        <w:spacing w:before="240"/>
       </w:pPr>
       <w:r>
         <w:t xml:space="preserve">7. </w:t>
@@ -13291,7 +13735,111 @@
         <w:t>сплывающие элементы интерфейса, используемые для выполнения целевых действий без перехода между страницами.</w:t>
       </w:r>
       <w:r>
-        <w:t xml:space="preserve"> К ним относятся: о</w:t>
+        <w:t xml:space="preserve"> </w:t>
+      </w:r>
+    </w:p>
+    <w:p>
+      <w:pPr>
+        <w:pStyle w:val="ab"/>
+        <w:keepNext/>
+        <w:spacing w:before="240"/>
+        <w:ind w:firstLine="0"/>
+        <w:jc w:val="center"/>
+      </w:pPr>
+      <w:r>
+        <w:rPr>
+          <w:noProof/>
+        </w:rPr>
+        <w:lastRenderedPageBreak/>
+        <w:drawing>
+          <wp:inline distT="0" distB="0" distL="0" distR="0" wp14:anchorId="6CC98FB0" wp14:editId="5A9968F3">
+            <wp:extent cx="2247900" cy="3160480"/>
+            <wp:effectExtent l="0" t="0" r="0" b="1905"/>
+            <wp:docPr id="27" name="Рисунок 27"/>
+            <wp:cNvGraphicFramePr>
+              <a:graphicFrameLocks xmlns:a="http://schemas.openxmlformats.org/drawingml/2006/main" noChangeAspect="1"/>
+            </wp:cNvGraphicFramePr>
+            <a:graphic xmlns:a="http://schemas.openxmlformats.org/drawingml/2006/main">
+              <a:graphicData uri="http://schemas.openxmlformats.org/drawingml/2006/picture">
+                <pic:pic xmlns:pic="http://schemas.openxmlformats.org/drawingml/2006/picture">
+                  <pic:nvPicPr>
+                    <pic:cNvPr id="0" name="Picture 4"/>
+                    <pic:cNvPicPr>
+                      <a:picLocks noChangeAspect="1" noChangeArrowheads="1"/>
+                    </pic:cNvPicPr>
+                  </pic:nvPicPr>
+                  <pic:blipFill>
+                    <a:blip r:embed="rId34">
+                      <a:extLst>
+                        <a:ext uri="{28A0092B-C50C-407E-A947-70E740481C1C}">
+                          <a14:useLocalDpi xmlns:a14="http://schemas.microsoft.com/office/drawing/2010/main" val="0"/>
+                        </a:ext>
+                      </a:extLst>
+                    </a:blip>
+                    <a:srcRect/>
+                    <a:stretch>
+                      <a:fillRect/>
+                    </a:stretch>
+                  </pic:blipFill>
+                  <pic:spPr bwMode="auto">
+                    <a:xfrm>
+                      <a:off x="0" y="0"/>
+                      <a:ext cx="2258766" cy="3175757"/>
+                    </a:xfrm>
+                    <a:prstGeom prst="rect">
+                      <a:avLst/>
+                    </a:prstGeom>
+                    <a:noFill/>
+                    <a:ln>
+                      <a:noFill/>
+                    </a:ln>
+                  </pic:spPr>
+                </pic:pic>
+              </a:graphicData>
+            </a:graphic>
+          </wp:inline>
+        </w:drawing>
+      </w:r>
+    </w:p>
+    <w:p>
+      <w:pPr>
+        <w:pStyle w:val="affa"/>
+      </w:pPr>
+      <w:r>
+        <w:t xml:space="preserve">Рис. </w:t>
+      </w:r>
+      <w:r>
+        <w:fldChar w:fldCharType="begin"/>
+      </w:r>
+      <w:r>
+        <w:instrText xml:space="preserve"> SEQ Рис. \* ARABIC </w:instrText>
+      </w:r>
+      <w:r>
+        <w:fldChar w:fldCharType="separate"/>
+      </w:r>
+      <w:r>
+        <w:rPr>
+          <w:noProof/>
+        </w:rPr>
+        <w:t>26</w:t>
+      </w:r>
+      <w:r>
+        <w:rPr>
+          <w:noProof/>
+        </w:rPr>
+        <w:fldChar w:fldCharType="end"/>
+      </w:r>
+      <w:r>
+        <w:t xml:space="preserve"> – Макет "Модальное окно создание подарка"</w:t>
+      </w:r>
+    </w:p>
+    <w:p>
+      <w:pPr>
+        <w:pStyle w:val="ab"/>
+        <w:spacing w:before="240"/>
+      </w:pPr>
+      <w:r>
+        <w:t>К ним относятся: о</w:t>
       </w:r>
       <w:r>
         <w:t xml:space="preserve">кно создания/редактирования подарка </w:t>
@@ -13326,11 +13874,199 @@
     </w:p>
     <w:p>
       <w:pPr>
-        <w:pStyle w:val="ab"/>
-      </w:pPr>
+        <w:rPr>
+          <w:rFonts w:ascii="Times New Roman" w:hAnsi="Times New Roman"/>
+          <w:sz w:val="28"/>
+        </w:rPr>
+      </w:pPr>
+      <w:r>
+        <w:br w:type="page"/>
+      </w:r>
+    </w:p>
+    <w:p>
+      <w:pPr>
+        <w:pStyle w:val="a2"/>
+      </w:pPr>
+      <w:bookmarkStart w:id="165" w:name="_Toc167839062"/>
+      <w:r>
+        <w:lastRenderedPageBreak/>
+        <w:t>ПРОЕКТНО</w:t>
+      </w:r>
+      <w:r>
+        <w:t>-ТЕХНОЛОГИЧЕСКАЯ ЧАСТЬ</w:t>
+      </w:r>
+      <w:bookmarkEnd w:id="165"/>
+    </w:p>
+    <w:p>
+      <w:pPr>
+        <w:pStyle w:val="a3"/>
+      </w:pPr>
+      <w:bookmarkStart w:id="166" w:name="_Toc167839063"/>
+      <w:r>
+        <w:t xml:space="preserve">Руководство </w:t>
+      </w:r>
+      <w:r>
+        <w:t>пользователя</w:t>
+      </w:r>
+      <w:bookmarkEnd w:id="166"/>
+    </w:p>
+    <w:p>
+      <w:pPr>
+        <w:pStyle w:val="ab"/>
+      </w:pPr>
+      <w:r>
+        <w:t xml:space="preserve">Перед началом работы с системой, требуется найти его в поддерживаемом внешнем сервисе. В зависимости от последнего, запуск может происходить через специализированного бота (например, в </w:t>
+      </w:r>
+      <w:r>
+        <w:rPr>
+          <w:lang w:val="en-US"/>
+        </w:rPr>
+        <w:t>Telegram</w:t>
+      </w:r>
+      <w:r>
+        <w:t>), либо через раздел сервисов (например, во ВКонтакте).</w:t>
+      </w:r>
+    </w:p>
+    <w:p>
+      <w:pPr>
+        <w:pStyle w:val="ab"/>
+      </w:pPr>
+      <w:r>
+        <w:t xml:space="preserve">Сперва, будет доступен гостевой режим, где есть возможность просматривать открытые списки желаний в сервисе. Для полноценной работы, требуется авторизация. При её инициализации, </w:t>
+      </w:r>
+      <w:r>
+        <w:t xml:space="preserve">будет производиться автоматическая </w:t>
+      </w:r>
+      <w:r>
+        <w:t>регистрация, на основе внешнего-агрегатора, через который был произведен вход.</w:t>
+      </w:r>
+    </w:p>
+    <w:p>
+      <w:pPr>
+        <w:pStyle w:val="ab"/>
+      </w:pPr>
+      <w:r>
+        <w:t>Далее будет доступен основной функционал приложения. Сверху отображается логотип приложения, а также ваш аватар. При взаимодействии с последним, вы сможете перейти в собственный профиль.</w:t>
+      </w:r>
+    </w:p>
+    <w:p>
+      <w:pPr>
+        <w:pStyle w:val="ab"/>
+      </w:pPr>
+      <w:r>
+        <w:t>Снизу приложения располагается навигационная панель, в которой отмечены основные разделы для посещения: «Главная», «Поиск», «Подписки» и «Мои списки».</w:t>
+      </w:r>
+    </w:p>
+    <w:p>
+      <w:pPr>
+        <w:pStyle w:val="ab"/>
+      </w:pPr>
+      <w:r>
+        <w:t xml:space="preserve">По умолчанию, </w:t>
+      </w:r>
+      <w:r>
+        <w:t xml:space="preserve">отображается раздел «Главная». Он представляет собой страницу с последними </w:t>
+      </w:r>
+      <w:r>
+        <w:t>событиями у тех пользователей, на которых вы подписаны. Это проявляется в показе их последних созданных списках и карточках пожеланий. Ниже этого показываются рекомендации, на основе действий в системе.</w:t>
+      </w:r>
+    </w:p>
+    <w:p>
+      <w:pPr>
+        <w:pStyle w:val="ab"/>
+      </w:pPr>
+      <w:r>
+        <w:t xml:space="preserve">Следующая страница «Поиск» позволяет находить для себя новые идеи для подарков. Для этого достаточно ввести в специальное поле то, чего хотелось бы добавить в свой </w:t>
+      </w:r>
+      <w:r>
+        <w:t>список желаемого. Это могут быть как конкретные предметы, их описание, или более абстрактные пожелания. Система постарается подобрать наиболее подходящее, не завися от четких формулировок запроса.</w:t>
+      </w:r>
+    </w:p>
+    <w:p>
+      <w:pPr>
+        <w:pStyle w:val="ab"/>
+      </w:pPr>
+      <w:r>
+        <w:t xml:space="preserve">«Подписки» дают возможность находить других пользователей приложения и отслеживать их интересы в рамках сервиса. Для поиска нужно ввести имя или никнейм пользователя. </w:t>
+      </w:r>
+    </w:p>
+    <w:p>
+      <w:pPr>
+        <w:pStyle w:val="ab"/>
+      </w:pPr>
+      <w:r>
+        <w:lastRenderedPageBreak/>
+        <w:t xml:space="preserve">После добавления в подписки, можно принимать участие в организации дарения. Для этого требуется выбрать подарок из списка пользователя и, если бронирование доступно, </w:t>
+      </w:r>
+      <w:r>
+        <w:t>зарезервировать лично</w:t>
+      </w:r>
+      <w:r>
+        <w:t xml:space="preserve"> или в составе группы. После этого, можно менять состояние бронирования</w:t>
+      </w:r>
+      <w:r>
+        <w:t>. Если выбранный подарок готов к вручению, можно сменить на статус «Ожидает подтверждения», что не позволяет добавляться другим присоединяться к дарению (если была групповое бронирование), а также дает владельцу карточки подарка подтвердить получение.</w:t>
+      </w:r>
+    </w:p>
+    <w:p>
+      <w:pPr>
+        <w:pStyle w:val="ab"/>
+      </w:pPr>
+      <w:r>
+        <w:t>Следующий раздел</w:t>
+      </w:r>
+      <w:r>
+        <w:t xml:space="preserve"> «Мои списки» </w:t>
+      </w:r>
+      <w:r>
+        <w:t>содержит настраиваемые коллекции подарков. Тут можно создавать новые списки, редактировать существующие и взаимодействовать с собственными карточками товаров. Также имеется возможность смены видимости коллекций для других пользователей приложения. Списки бывают публичными для всех, доступными для подписчиков или приватными.</w:t>
+      </w:r>
+    </w:p>
+    <w:p>
+      <w:pPr>
+        <w:pStyle w:val="ab"/>
+      </w:pPr>
+      <w:r>
+        <w:t>В «Профиле» будет отображаться актуальная информация вашего аккаунта. С внешнего сервиса, через который был совершен вход, передаются данные об фото, имени и никнейме. Еще в данном разделе есть настройки приватности профиля; возможность отображения статуса подарка, чтобы не видеть, что выбрано для бронирования из личных списков</w:t>
+      </w:r>
+      <w:r>
+        <w:t>; а также сокрытие интересов аккаунта от посторонних пользователей.</w:t>
+      </w:r>
+    </w:p>
+    <w:p>
+      <w:pPr>
+        <w:pStyle w:val="ab"/>
+      </w:pPr>
+      <w:r>
+        <w:t>Ниже, располагаются главные интересы, связанные с аккаунтом. Так можно отслеживать, какие увлечения считает система приоритетными для рекомендаций. Ниже дополнительно представлен доступ к спискам желаемого профиля.</w:t>
+      </w:r>
+    </w:p>
+    <w:p>
+      <w:pPr>
+        <w:pStyle w:val="a3"/>
+      </w:pPr>
+      <w:r>
+        <w:t>Тестирование пользовательского интерфейс</w:t>
+      </w:r>
+      <w:r>
+        <w:t>а</w:t>
+      </w:r>
+    </w:p>
+    <w:p>
+      <w:pPr>
+        <w:pStyle w:val="ab"/>
+      </w:pPr>
+    </w:p>
+    <w:p>
+      <w:pPr>
+        <w:pStyle w:val="a3"/>
+      </w:pPr>
+      <w:r>
+        <w:t>Расчет себестоимости разработки</w:t>
+      </w:r>
     </w:p>
     <w:sectPr>
-      <w:footerReference w:type="default" r:id="rId31"/>
+      <w:footerReference w:type="default" r:id="rId35"/>
       <w:pgSz w:w="11906" w:h="16838" w:code="9"/>
       <w:pgMar w:top="1134" w:right="567" w:bottom="1134" w:left="1701" w:header="709" w:footer="709" w:gutter="0"/>
       <w:cols w:space="708"/>

</xml_diff>